<commit_message>
Dernieres modificaiton faites avant la presentation projet mida
</commit_message>
<xml_diff>
--- a/docs/Guide-utilisateur-LAFACTURE.docx
+++ b/docs/Guide-utilisateur-LAFACTURE.docx
@@ -6,18 +6,16 @@
     <w:p/>
     <w:p/>
     <w:p/>
-    <w:p/>
-    <w:p/>
     <w:p>
       <w:pPr>
         <w:jc w:val="center"/>
       </w:pPr>
       <w:r>
         <w:rPr>
-          <w:rFonts w:ascii="Calibri" w:hAnsi="Calibri"/>
+          <w:rFonts w:ascii="Calibri Light" w:hAnsi="Calibri Light"/>
           <w:b/>
           <w:color w:val="14213D"/>
-          <w:sz w:val="72"/>
+          <w:sz w:val="56"/>
         </w:rPr>
         <w:t>LAFACTURE</w:t>
       </w:r>
@@ -29,10 +27,10 @@
       <w:r>
         <w:rPr>
           <w:rFonts w:ascii="Calibri" w:hAnsi="Calibri"/>
-          <w:color w:val="FCA311"/>
-          <w:sz w:val="40"/>
+          <w:color w:val="555555"/>
+          <w:sz w:val="28"/>
         </w:rPr>
-        <w:t>Version 1.1</w:t>
+        <w:t>Plateforme SaaS de Facturation</w:t>
       </w:r>
     </w:p>
     <w:p/>
@@ -42,43 +40,115 @@
       </w:pPr>
       <w:r>
         <w:rPr>
-          <w:rFonts w:ascii="Calibri" w:hAnsi="Calibri"/>
-          <w:sz w:val="26"/>
+          <w:rFonts w:ascii="Calibri Light" w:hAnsi="Calibri Light"/>
+          <w:b/>
+          <w:color w:val="14213D"/>
+          <w:sz w:val="36"/>
         </w:rPr>
-        <w:t>Facturation simple pour freelances &amp; TPE</w:t>
+        <w:t>GUIDE UTILISATEUR</w:t>
       </w:r>
     </w:p>
     <w:p/>
-    <w:p/>
-    <w:p/>
-    <w:p/>
     <w:p>
       <w:pPr>
         <w:jc w:val="center"/>
       </w:pPr>
       <w:r>
         <w:rPr>
-          <w:rFonts w:ascii="Calibri" w:hAnsi="Calibri"/>
+          <w:b/>
           <w:sz w:val="20"/>
         </w:rPr>
-        <w:t>Version du document : 1.1</w:t>
-        <w:br/>
+        <w:t xml:space="preserve">Entreprise — </w:t>
       </w:r>
       <w:r>
         <w:rPr>
-          <w:rFonts w:ascii="Calibri" w:hAnsi="Calibri"/>
           <w:sz w:val="20"/>
         </w:rPr>
-        <w:t>Date : 02/06/2026</w:t>
-        <w:br/>
+        <w:t>LAFACTURE</w:t>
+      </w:r>
+    </w:p>
+    <w:p>
+      <w:pPr>
+        <w:jc w:val="center"/>
+      </w:pPr>
+      <w:r>
+        <w:rPr>
+          <w:b/>
+          <w:sz w:val="20"/>
+        </w:rPr>
+        <w:t xml:space="preserve">Projet — </w:t>
       </w:r>
       <w:r>
         <w:rPr>
-          <w:rFonts w:ascii="Calibri" w:hAnsi="Calibri"/>
           <w:sz w:val="20"/>
         </w:rPr>
-        <w:t>Historique : le produit porte désormais l'identité LAFACTURE (2026).</w:t>
-        <w:br/>
+        <w:t>LAFACTURE — La Facture</w:t>
+      </w:r>
+    </w:p>
+    <w:p>
+      <w:pPr>
+        <w:jc w:val="center"/>
+      </w:pPr>
+      <w:r>
+        <w:rPr>
+          <w:b/>
+          <w:sz w:val="20"/>
+        </w:rPr>
+        <w:t xml:space="preserve">Email — </w:t>
+      </w:r>
+      <w:r>
+        <w:rPr>
+          <w:sz w:val="20"/>
+        </w:rPr>
+        <w:t>essev2030@gmail.com</w:t>
+      </w:r>
+    </w:p>
+    <w:p>
+      <w:pPr>
+        <w:jc w:val="center"/>
+      </w:pPr>
+      <w:r>
+        <w:rPr>
+          <w:b/>
+          <w:sz w:val="20"/>
+        </w:rPr>
+        <w:t xml:space="preserve">Version — </w:t>
+      </w:r>
+      <w:r>
+        <w:rPr>
+          <w:sz w:val="20"/>
+        </w:rPr>
+        <w:t>1.0</w:t>
+      </w:r>
+    </w:p>
+    <w:p>
+      <w:pPr>
+        <w:jc w:val="center"/>
+      </w:pPr>
+      <w:r>
+        <w:rPr>
+          <w:b/>
+          <w:sz w:val="20"/>
+        </w:rPr>
+        <w:t xml:space="preserve">Personne à contacter — </w:t>
+      </w:r>
+      <w:r>
+        <w:rPr>
+          <w:sz w:val="20"/>
+        </w:rPr>
+        <w:t>ESSE Henry-Joel</w:t>
+      </w:r>
+    </w:p>
+    <w:p>
+      <w:pPr>
+        <w:jc w:val="center"/>
+      </w:pPr>
+      <w:r>
+        <w:rPr>
+          <w:color w:val="555555"/>
+          <w:sz w:val="20"/>
+        </w:rPr>
+        <w:t>ESSE Henry-Joel · Juin 2026</w:t>
       </w:r>
     </w:p>
     <w:p>
@@ -88,60 +158,21 @@
     </w:p>
     <w:p>
       <w:pPr>
-        <w:pStyle w:val="Heading1"/>
+        <w:spacing w:before="280" w:after="120"/>
       </w:pPr>
       <w:r>
         <w:rPr>
-          <w:rFonts w:ascii="Calibri" w:hAnsi="Calibri"/>
+          <w:rFonts w:ascii="Calibri Light" w:hAnsi="Calibri Light"/>
+          <w:b/>
           <w:color w:val="14213D"/>
+          <w:sz w:val="32"/>
         </w:rPr>
-        <w:t>Table des matières</w:t>
+        <w:t>Informations document</w:t>
       </w:r>
     </w:p>
     <w:p>
-      <w:r>
-        <w:fldChar w:fldCharType="begin"/>
-        <w:instrText xml:space="preserve"> TOC \o "1-3" \h \z \u </w:instrText>
-        <w:fldChar w:fldCharType="separate"/>
-      </w:r>
-      <w:r>
-        <w:fldChar w:fldCharType="end"/>
-      </w:r>
-    </w:p>
-    <w:p>
-      <w:pPr>
-        <w:spacing w:after="120" w:line="240" w:lineRule="auto"/>
-      </w:pPr>
-      <w:r>
-        <w:rPr>
-          <w:rFonts w:ascii="Calibri" w:hAnsi="Calibri"/>
-          <w:b w:val="0"/>
-          <w:color w:val="666666"/>
-          <w:sz w:val="18"/>
-        </w:rPr>
-        <w:t>Actualisez la table des matières dans Word : clic droit → Mettre à jour le champ.</w:t>
-      </w:r>
-    </w:p>
-    <w:p>
-      <w:r>
-        <w:br w:type="page"/>
-      </w:r>
-    </w:p>
-    <w:p>
-      <w:pPr>
-        <w:pStyle w:val="Heading1"/>
-      </w:pPr>
-      <w:r>
-        <w:rPr>
-          <w:rFonts w:ascii="Calibri" w:hAnsi="Calibri"/>
-          <w:color w:val="14213D"/>
-        </w:rPr>
-        <w:t>1. Introduction</w:t>
-      </w:r>
-    </w:p>
-    <w:p>
-      <w:pPr>
-        <w:spacing w:after="120" w:line="240" w:lineRule="auto"/>
+      <w:pPr>
+        <w:spacing w:after="120" w:line="276" w:lineRule="auto"/>
       </w:pPr>
       <w:r>
         <w:rPr>
@@ -149,12 +180,12 @@
           <w:b w:val="0"/>
           <w:sz w:val="22"/>
         </w:rPr>
-        <w:t>Ce guide décrit l'utilisation de LAFACTURE, application web de facturation pour freelances et TPE.</w:t>
+        <w:t>Version du document : 2.0</w:t>
       </w:r>
     </w:p>
     <w:p>
       <w:pPr>
-        <w:spacing w:after="120" w:line="240" w:lineRule="auto"/>
+        <w:spacing w:after="120" w:line="276" w:lineRule="auto"/>
       </w:pPr>
       <w:r>
         <w:rPr>
@@ -162,17 +193,86 @@
           <w:b w:val="0"/>
           <w:sz w:val="22"/>
         </w:rPr>
-        <w:t>Historique : le produit porte désormais l'identité LAFACTURE (2026).</w:t>
+        <w:t>Date : 08/06/2026</w:t>
       </w:r>
     </w:p>
     <w:p>
       <w:pPr>
-        <w:pStyle w:val="Heading2"/>
+        <w:spacing w:after="120" w:line="276" w:lineRule="auto"/>
       </w:pPr>
       <w:r>
         <w:rPr>
           <w:rFonts w:ascii="Calibri" w:hAnsi="Calibri"/>
+          <w:b w:val="0"/>
+          <w:sz w:val="22"/>
+        </w:rPr>
+        <w:t>Ce guide décrit l'utilisation de LAFACTURE tel que déployé dans le dépôt saas-facturation.</w:t>
+      </w:r>
+    </w:p>
+    <w:p>
+      <w:pPr>
+        <w:spacing w:before="280" w:after="120"/>
+      </w:pPr>
+      <w:r>
+        <w:rPr>
+          <w:rFonts w:ascii="Calibri Light" w:hAnsi="Calibri Light"/>
+          <w:b/>
           <w:color w:val="14213D"/>
+          <w:sz w:val="32"/>
+        </w:rPr>
+        <w:t>Table des matières</w:t>
+      </w:r>
+    </w:p>
+    <w:p>
+      <w:pPr>
+        <w:spacing w:after="120" w:line="276" w:lineRule="auto"/>
+      </w:pPr>
+      <w:r>
+        <w:rPr>
+          <w:rFonts w:ascii="Calibri" w:hAnsi="Calibri"/>
+          <w:b w:val="0"/>
+          <w:sz w:val="22"/>
+        </w:rPr>
+        <w:t>Actualisez la table des matières dans Word : clic droit → Mettre à jour le champ.</w:t>
+      </w:r>
+    </w:p>
+    <w:p>
+      <w:pPr>
+        <w:spacing w:before="280" w:after="120"/>
+      </w:pPr>
+      <w:r>
+        <w:rPr>
+          <w:rFonts w:ascii="Calibri Light" w:hAnsi="Calibri Light"/>
+          <w:b/>
+          <w:color w:val="14213D"/>
+          <w:sz w:val="32"/>
+        </w:rPr>
+        <w:t>1. Introduction</w:t>
+      </w:r>
+    </w:p>
+    <w:p>
+      <w:pPr>
+        <w:spacing w:after="120" w:line="276" w:lineRule="auto"/>
+      </w:pPr>
+      <w:r>
+        <w:rPr>
+          <w:rFonts w:ascii="Calibri" w:hAnsi="Calibri"/>
+          <w:b w:val="0"/>
+          <w:sz w:val="22"/>
+        </w:rPr>
+        <w:t>LAFACTURE est une application web de facturation destinée aux freelances et TPE. Elle permet de gérer clients, devis, factures, paiements, rapports et exports PDF/CSV depuis un navigateur, sans installation locale.</w:t>
+      </w:r>
+    </w:p>
+    <w:p>
+      <w:pPr>
+        <w:spacing w:before="200" w:after="120"/>
+      </w:pPr>
+      <w:r>
+        <w:rPr>
+          <w:rFonts w:ascii="Calibri Light" w:hAnsi="Calibri Light"/>
+          <w:b/>
+          <w:color w:val="14213D"/>
+          <w:sz w:val="26"/>
         </w:rPr>
         <w:t>1.1 Terminologie</w:t>
       </w:r>
@@ -191,9 +291,15 @@
         <w:tc>
           <w:tcPr>
             <w:tcW w:type="dxa" w:w="4703"/>
+            <w:shd w:fill="F2F2F2"/>
           </w:tcPr>
           <w:p>
             <w:r>
+              <w:rPr>
+                <w:rFonts w:ascii="Calibri" w:hAnsi="Calibri"/>
+                <w:b/>
+                <w:sz w:val="20"/>
+              </w:rPr>
               <w:t>Terme</w:t>
             </w:r>
           </w:p>
@@ -201,9 +307,15 @@
         <w:tc>
           <w:tcPr>
             <w:tcW w:type="dxa" w:w="4703"/>
+            <w:shd w:fill="F2F2F2"/>
           </w:tcPr>
           <w:p>
             <w:r>
+              <w:rPr>
+                <w:rFonts w:ascii="Calibri" w:hAnsi="Calibri"/>
+                <w:b/>
+                <w:sz w:val="20"/>
+              </w:rPr>
               <w:t>Définition</w:t>
             </w:r>
           </w:p>
@@ -216,6 +328,10 @@
           </w:tcPr>
           <w:p>
             <w:r>
+              <w:rPr>
+                <w:rFonts w:ascii="Calibri" w:hAnsi="Calibri"/>
+                <w:sz w:val="20"/>
+              </w:rPr>
               <w:t>Devis</w:t>
             </w:r>
           </w:p>
@@ -226,7 +342,11 @@
           </w:tcPr>
           <w:p>
             <w:r>
-              <w:t>Proposition commerciale avant prestation (numérotation DEV-YYYY-NNNN).</w:t>
+              <w:rPr>
+                <w:rFonts w:ascii="Calibri" w:hAnsi="Calibri"/>
+                <w:sz w:val="20"/>
+              </w:rPr>
+              <w:t>Proposition commerciale numérotée DEV-AAAA-NNNN</w:t>
             </w:r>
           </w:p>
         </w:tc>
@@ -238,6 +358,10 @@
           </w:tcPr>
           <w:p>
             <w:r>
+              <w:rPr>
+                <w:rFonts w:ascii="Calibri" w:hAnsi="Calibri"/>
+                <w:sz w:val="20"/>
+              </w:rPr>
               <w:t>Facture</w:t>
             </w:r>
           </w:p>
@@ -248,7 +372,11 @@
           </w:tcPr>
           <w:p>
             <w:r>
-              <w:t>Document de facturation (FAC-YYYY-NNNN).</w:t>
+              <w:rPr>
+                <w:rFonts w:ascii="Calibri" w:hAnsi="Calibri"/>
+                <w:sz w:val="20"/>
+              </w:rPr>
+              <w:t>Document de vente numéroté FAC-AAAA-NNNN</w:t>
             </w:r>
           </w:p>
         </w:tc>
@@ -260,6 +388,10 @@
           </w:tcPr>
           <w:p>
             <w:r>
+              <w:rPr>
+                <w:rFonts w:ascii="Calibri" w:hAnsi="Calibri"/>
+                <w:sz w:val="20"/>
+              </w:rPr>
               <w:t>Avoir</w:t>
             </w:r>
           </w:p>
@@ -270,7 +402,11 @@
           </w:tcPr>
           <w:p>
             <w:r>
-              <w:t>Facture rectificative AVR-YYYY-NNNN annulant totalement une facture émise (1 max).</w:t>
+              <w:rPr>
+                <w:rFonts w:ascii="Calibri" w:hAnsi="Calibri"/>
+                <w:sz w:val="20"/>
+              </w:rPr>
+              <w:t>Note de crédit AVR-AAAA-NNNN liée à une facture</w:t>
             </w:r>
           </w:p>
         </w:tc>
@@ -282,7 +418,11 @@
           </w:tcPr>
           <w:p>
             <w:r>
-              <w:t>Encours</w:t>
+              <w:rPr>
+                <w:rFonts w:ascii="Calibri" w:hAnsi="Calibri"/>
+                <w:sz w:val="20"/>
+              </w:rPr>
+              <w:t>Encaissé / CA</w:t>
             </w:r>
           </w:p>
         </w:tc>
@@ -292,7 +432,11 @@
           </w:tcPr>
           <w:p>
             <w:r>
-              <w:t>Montants facturés non encore encaissés.</w:t>
+              <w:rPr>
+                <w:rFonts w:ascii="Calibri" w:hAnsi="Calibri"/>
+                <w:sz w:val="20"/>
+              </w:rPr>
+              <w:t>Somme des paiements enregistrés sur les factures</w:t>
             </w:r>
           </w:p>
         </w:tc>
@@ -304,7 +448,11 @@
           </w:tcPr>
           <w:p>
             <w:r>
-              <w:t>Plan Gratuit / Pro / Entreprise</w:t>
+              <w:rPr>
+                <w:rFonts w:ascii="Calibri" w:hAnsi="Calibri"/>
+                <w:sz w:val="20"/>
+              </w:rPr>
+              <w:t>Encours</w:t>
             </w:r>
           </w:p>
         </w:tc>
@@ -314,25 +462,57 @@
           </w:tcPr>
           <w:p>
             <w:r>
-              <w:t>Niveaux d'abonnement SaaS (Stripe pour Pro).</w:t>
+              <w:rPr>
+                <w:rFonts w:ascii="Calibri" w:hAnsi="Calibri"/>
+                <w:sz w:val="20"/>
+              </w:rPr>
+              <w:t>Montant restant dû sur les factures envoyées ou en retard</w:t>
+            </w:r>
+          </w:p>
+        </w:tc>
+      </w:tr>
+      <w:tr>
+        <w:tc>
+          <w:tcPr>
+            <w:tcW w:type="dxa" w:w="4703"/>
+          </w:tcPr>
+          <w:p>
+            <w:r>
+              <w:rPr>
+                <w:rFonts w:ascii="Calibri" w:hAnsi="Calibri"/>
+                <w:sz w:val="20"/>
+              </w:rPr>
+              <w:t>Brouillon</w:t>
+            </w:r>
+          </w:p>
+        </w:tc>
+        <w:tc>
+          <w:tcPr>
+            <w:tcW w:type="dxa" w:w="4703"/>
+          </w:tcPr>
+          <w:p>
+            <w:r>
+              <w:rPr>
+                <w:rFonts w:ascii="Calibri" w:hAnsi="Calibri"/>
+                <w:sz w:val="20"/>
+              </w:rPr>
+              <w:t>Document modifiable non encore finalisé</w:t>
             </w:r>
           </w:p>
         </w:tc>
       </w:tr>
     </w:tbl>
+    <w:p/>
     <w:p>
-      <w:r>
-        <w:br w:type="page"/>
-      </w:r>
-    </w:p>
-    <w:p>
-      <w:pPr>
-        <w:pStyle w:val="Heading1"/>
+      <w:pPr>
+        <w:spacing w:before="280" w:after="120"/>
       </w:pPr>
       <w:r>
         <w:rPr>
-          <w:rFonts w:ascii="Calibri" w:hAnsi="Calibri"/>
+          <w:rFonts w:ascii="Calibri Light" w:hAnsi="Calibri Light"/>
+          <w:b/>
           <w:color w:val="14213D"/>
+          <w:sz w:val="32"/>
         </w:rPr>
         <w:t>2. Prérequis et accès</w:t>
       </w:r>
@@ -340,7 +520,7 @@
     <w:p>
       <w:pPr>
         <w:pStyle w:val="ListBullet"/>
-        <w:spacing w:after="80" w:line="240" w:lineRule="auto"/>
+        <w:spacing w:after="120" w:line="276" w:lineRule="auto"/>
       </w:pPr>
       <w:r>
         <w:rPr>
@@ -354,7 +534,7 @@
     <w:p>
       <w:pPr>
         <w:pStyle w:val="ListBullet"/>
-        <w:spacing w:after="80" w:line="240" w:lineRule="auto"/>
+        <w:spacing w:after="120" w:line="276" w:lineRule="auto"/>
       </w:pPr>
       <w:r>
         <w:rPr>
@@ -367,8 +547,7 @@
     </w:p>
     <w:p>
       <w:pPr>
-        <w:pStyle w:val="ListNumber"/>
-        <w:spacing w:after="80" w:line="240" w:lineRule="auto"/>
+        <w:spacing w:after="120" w:line="276" w:lineRule="auto"/>
       </w:pPr>
       <w:r>
         <w:rPr>
@@ -376,13 +555,13 @@
           <w:b w:val="0"/>
           <w:sz w:val="22"/>
         </w:rPr>
-        <w:t>1. Ouvrez https://saas-facturation.vercel.app</w:t>
+        <w:t>Accès local (développement) :</w:t>
       </w:r>
     </w:p>
     <w:p>
       <w:pPr>
         <w:pStyle w:val="ListNumber"/>
-        <w:spacing w:after="80" w:line="240" w:lineRule="auto"/>
+        <w:spacing w:after="120" w:line="276" w:lineRule="auto"/>
       </w:pPr>
       <w:r>
         <w:rPr>
@@ -390,70 +569,78 @@
           <w:b w:val="0"/>
           <w:sz w:val="22"/>
         </w:rPr>
-        <w:t>2. La page d'accueil LAFACTURE s'affiche.</w:t>
+        <w:t>1. Démarrer le backend : php artisan serve (port 8000).</w:t>
       </w:r>
     </w:p>
     <w:p>
       <w:pPr>
-        <w:jc w:val="center"/>
-        <w:pBdr>
-          <w:top w:val="single" w:sz="4" w:space="4" w:color="FCA311"/>
-          <w:left w:val="single" w:sz="4" w:space="4" w:color="FCA311"/>
-          <w:bottom w:val="single" w:sz="4" w:space="4" w:color="FCA311"/>
-          <w:right w:val="single" w:sz="4" w:space="4" w:color="FCA311"/>
-        </w:pBdr>
+        <w:pStyle w:val="ListNumber"/>
+        <w:spacing w:after="120" w:line="276" w:lineRule="auto"/>
       </w:pPr>
       <w:r>
         <w:rPr>
           <w:rFonts w:ascii="Calibri" w:hAnsi="Calibri"/>
-          <w:b/>
+          <w:b w:val="0"/>
+          <w:sz w:val="22"/>
+        </w:rPr>
+        <w:t>2. Démarrer le frontend : npm run dev (port 5173).</w:t>
+      </w:r>
+    </w:p>
+    <w:p>
+      <w:pPr>
+        <w:pStyle w:val="ListNumber"/>
+        <w:spacing w:after="120" w:line="276" w:lineRule="auto"/>
+      </w:pPr>
+      <w:r>
+        <w:rPr>
+          <w:rFonts w:ascii="Calibri" w:hAnsi="Calibri"/>
+          <w:b w:val="0"/>
+          <w:sz w:val="22"/>
+        </w:rPr>
+        <w:t>3. Ouvrir http://localhost:5173</w:t>
+      </w:r>
+    </w:p>
+    <w:p>
+      <w:r>
+        <w:rPr>
           <w:i/>
-          <w:color w:val="FCA311"/>
           <w:sz w:val="20"/>
         </w:rPr>
         <w:t>[CAPTURE D'ÉCRAN — Page d'accueil LAFACTURE]</w:t>
       </w:r>
     </w:p>
     <w:p>
-      <w:pPr>
-        <w:spacing w:after="200" w:line="240" w:lineRule="auto"/>
-        <w:jc w:val="center"/>
-      </w:pPr>
       <w:r>
         <w:rPr>
-          <w:rFonts w:ascii="Calibri" w:hAnsi="Calibri"/>
-          <w:b w:val="0"/>
-          <w:color w:val="666666"/>
           <w:sz w:val="18"/>
         </w:rPr>
         <w:t>Page d'accueil LAFACTURE</w:t>
       </w:r>
     </w:p>
     <w:p>
-      <w:r>
-        <w:br w:type="page"/>
-      </w:r>
-    </w:p>
-    <w:p>
-      <w:pPr>
-        <w:pStyle w:val="Heading1"/>
+      <w:pPr>
+        <w:spacing w:before="280" w:after="120"/>
       </w:pPr>
       <w:r>
         <w:rPr>
-          <w:rFonts w:ascii="Calibri" w:hAnsi="Calibri"/>
+          <w:rFonts w:ascii="Calibri Light" w:hAnsi="Calibri Light"/>
+          <w:b/>
           <w:color w:val="14213D"/>
+          <w:sz w:val="32"/>
         </w:rPr>
         <w:t>3. Inscription et connexion</w:t>
       </w:r>
     </w:p>
     <w:p>
       <w:pPr>
-        <w:pStyle w:val="Heading2"/>
+        <w:spacing w:before="200" w:after="120"/>
       </w:pPr>
       <w:r>
         <w:rPr>
-          <w:rFonts w:ascii="Calibri" w:hAnsi="Calibri"/>
+          <w:rFonts w:ascii="Calibri Light" w:hAnsi="Calibri Light"/>
+          <w:b/>
           <w:color w:val="14213D"/>
+          <w:sz w:val="26"/>
         </w:rPr>
         <w:t>3.1 Créer un compte</w:t>
       </w:r>
@@ -461,7 +648,7 @@
     <w:p>
       <w:pPr>
         <w:pStyle w:val="ListNumber"/>
-        <w:spacing w:after="80" w:line="240" w:lineRule="auto"/>
+        <w:spacing w:after="120" w:line="276" w:lineRule="auto"/>
       </w:pPr>
       <w:r>
         <w:rPr>
@@ -469,13 +656,13 @@
           <w:b w:val="0"/>
           <w:sz w:val="22"/>
         </w:rPr>
-        <w:t>1. Cliquez sur « Commencer gratuitement » ou « S'inscrire ».</w:t>
+        <w:t>Cliquez sur « Commencer gratuitement » ou « S'inscrire ».</w:t>
       </w:r>
     </w:p>
     <w:p>
       <w:pPr>
         <w:pStyle w:val="ListNumber"/>
-        <w:spacing w:after="80" w:line="240" w:lineRule="auto"/>
+        <w:spacing w:after="120" w:line="276" w:lineRule="auto"/>
       </w:pPr>
       <w:r>
         <w:rPr>
@@ -483,13 +670,13 @@
           <w:b w:val="0"/>
           <w:sz w:val="22"/>
         </w:rPr>
-        <w:t>2. Renseignez nom, e-mail et mot de passe (8 car. min, lettre, chiffre, symbole).</w:t>
+        <w:t>Renseignez nom, e-mail et mot de passe (8 caractères minimum, lettre, chiffre et symbole).</w:t>
       </w:r>
     </w:p>
     <w:p>
       <w:pPr>
         <w:pStyle w:val="ListNumber"/>
-        <w:spacing w:after="80" w:line="240" w:lineRule="auto"/>
+        <w:spacing w:after="120" w:line="276" w:lineRule="auto"/>
       </w:pPr>
       <w:r>
         <w:rPr>
@@ -497,13 +684,13 @@
           <w:b w:val="0"/>
           <w:sz w:val="22"/>
         </w:rPr>
-        <w:t>3. Cliquez sur « Créer mon compte ».</w:t>
+        <w:t>Cliquez sur « Créer mon compte ».</w:t>
       </w:r>
     </w:p>
     <w:p>
       <w:pPr>
         <w:pStyle w:val="ListNumber"/>
-        <w:spacing w:after="80" w:line="240" w:lineRule="auto"/>
+        <w:spacing w:after="120" w:line="276" w:lineRule="auto"/>
       </w:pPr>
       <w:r>
         <w:rPr>
@@ -511,40 +698,21 @@
           <w:b w:val="0"/>
           <w:sz w:val="22"/>
         </w:rPr>
-        <w:t>4. Connectez-vous — aucune vérification e-mail n'est requise (désactivée volontairement).</w:t>
+        <w:t>Connectez-vous — aucune vérification e-mail n'est requise.</w:t>
       </w:r>
     </w:p>
     <w:p>
-      <w:pPr>
-        <w:jc w:val="center"/>
-        <w:pBdr>
-          <w:top w:val="single" w:sz="4" w:space="4" w:color="FCA311"/>
-          <w:left w:val="single" w:sz="4" w:space="4" w:color="FCA311"/>
-          <w:bottom w:val="single" w:sz="4" w:space="4" w:color="FCA311"/>
-          <w:right w:val="single" w:sz="4" w:space="4" w:color="FCA311"/>
-        </w:pBdr>
-      </w:pPr>
       <w:r>
         <w:rPr>
-          <w:rFonts w:ascii="Calibri" w:hAnsi="Calibri"/>
-          <w:b/>
           <w:i/>
-          <w:color w:val="FCA311"/>
           <w:sz w:val="20"/>
         </w:rPr>
         <w:t>[CAPTURE D'ÉCRAN — Formulaire d'inscription]</w:t>
       </w:r>
     </w:p>
     <w:p>
-      <w:pPr>
-        <w:spacing w:after="200" w:line="240" w:lineRule="auto"/>
-        <w:jc w:val="center"/>
-      </w:pPr>
       <w:r>
         <w:rPr>
-          <w:rFonts w:ascii="Calibri" w:hAnsi="Calibri"/>
-          <w:b w:val="0"/>
-          <w:color w:val="666666"/>
           <w:sz w:val="18"/>
         </w:rPr>
         <w:t>Formulaire d'inscription</w:t>
@@ -552,42 +720,36 @@
     </w:p>
     <w:p>
       <w:pPr>
-        <w:spacing w:after="160" w:line="240" w:lineRule="auto"/>
+        <w:spacing w:before="200" w:after="120"/>
       </w:pPr>
       <w:r>
         <w:rPr>
-          <w:rFonts w:ascii="Calibri" w:hAnsi="Calibri"/>
-          <w:b w:val="0"/>
+          <w:rFonts w:ascii="Calibri Light" w:hAnsi="Calibri Light"/>
+          <w:b/>
           <w:color w:val="14213D"/>
-          <w:sz w:val="22"/>
+          <w:sz w:val="26"/>
         </w:rPr>
-        <w:t xml:space="preserve">Remarque — </w:t>
+        <w:t>3.2 Se connecter</w:t>
       </w:r>
+    </w:p>
+    <w:p>
+      <w:pPr>
+        <w:pStyle w:val="ListNumber"/>
+        <w:spacing w:after="120" w:line="276" w:lineRule="auto"/>
+      </w:pPr>
       <w:r>
         <w:rPr>
           <w:rFonts w:ascii="Calibri" w:hAnsi="Calibri"/>
           <w:b w:val="0"/>
           <w:sz w:val="22"/>
         </w:rPr>
-        <w:t>Compte plan Gratuit par défaut (10 factures/mois).</w:t>
+        <w:t>Page Connexion : saisissez e-mail et mot de passe.</w:t>
       </w:r>
     </w:p>
     <w:p>
       <w:pPr>
-        <w:pStyle w:val="Heading2"/>
-      </w:pPr>
-      <w:r>
-        <w:rPr>
-          <w:rFonts w:ascii="Calibri" w:hAnsi="Calibri"/>
-          <w:color w:val="14213D"/>
-        </w:rPr>
-        <w:t>3.2 Se connecter</w:t>
-      </w:r>
-    </w:p>
-    <w:p>
-      <w:pPr>
         <w:pStyle w:val="ListNumber"/>
-        <w:spacing w:after="80" w:line="240" w:lineRule="auto"/>
+        <w:spacing w:after="120" w:line="276" w:lineRule="auto"/>
       </w:pPr>
       <w:r>
         <w:rPr>
@@ -595,13 +757,44 @@
           <w:b w:val="0"/>
           <w:sz w:val="22"/>
         </w:rPr>
-        <w:t>1. Page Connexion : e-mail + mot de passe.</w:t>
+        <w:t>Redirection automatique vers /app (tableau de bord).</w:t>
       </w:r>
     </w:p>
     <w:p>
+      <w:r>
+        <w:rPr>
+          <w:i/>
+          <w:sz w:val="20"/>
+        </w:rPr>
+        <w:t>[CAPTURE D'ÉCRAN — Page de connexion]</w:t>
+      </w:r>
+    </w:p>
+    <w:p>
+      <w:r>
+        <w:rPr>
+          <w:sz w:val="18"/>
+        </w:rPr>
+        <w:t>Page de connexion</w:t>
+      </w:r>
+    </w:p>
+    <w:p>
+      <w:pPr>
+        <w:spacing w:before="200" w:after="120"/>
+      </w:pPr>
+      <w:r>
+        <w:rPr>
+          <w:rFonts w:ascii="Calibri Light" w:hAnsi="Calibri Light"/>
+          <w:b/>
+          <w:color w:val="14213D"/>
+          <w:sz w:val="26"/>
+        </w:rPr>
+        <w:t>3.3 Mot de passe oublié</w:t>
+      </w:r>
+    </w:p>
+    <w:p>
       <w:pPr>
         <w:pStyle w:val="ListNumber"/>
-        <w:spacing w:after="80" w:line="240" w:lineRule="auto"/>
+        <w:spacing w:after="120" w:line="276" w:lineRule="auto"/>
       </w:pPr>
       <w:r>
         <w:rPr>
@@ -609,61 +802,13 @@
           <w:b w:val="0"/>
           <w:sz w:val="22"/>
         </w:rPr>
-        <w:t>2. Redirection vers /app (tableau de bord).</w:t>
+        <w:t>Cliquez « Mot de passe oublié ? » et saisissez votre e-mail.</w:t>
       </w:r>
     </w:p>
     <w:p>
       <w:pPr>
-        <w:jc w:val="center"/>
-        <w:pBdr>
-          <w:top w:val="single" w:sz="4" w:space="4" w:color="FCA311"/>
-          <w:left w:val="single" w:sz="4" w:space="4" w:color="FCA311"/>
-          <w:bottom w:val="single" w:sz="4" w:space="4" w:color="FCA311"/>
-          <w:right w:val="single" w:sz="4" w:space="4" w:color="FCA311"/>
-        </w:pBdr>
-      </w:pPr>
-      <w:r>
-        <w:rPr>
-          <w:rFonts w:ascii="Calibri" w:hAnsi="Calibri"/>
-          <w:b/>
-          <w:i/>
-          <w:color w:val="FCA311"/>
-          <w:sz w:val="20"/>
-        </w:rPr>
-        <w:t>[CAPTURE D'ÉCRAN — Page de connexion]</w:t>
-      </w:r>
-    </w:p>
-    <w:p>
-      <w:pPr>
-        <w:spacing w:after="200" w:line="240" w:lineRule="auto"/>
-        <w:jc w:val="center"/>
-      </w:pPr>
-      <w:r>
-        <w:rPr>
-          <w:rFonts w:ascii="Calibri" w:hAnsi="Calibri"/>
-          <w:b w:val="0"/>
-          <w:color w:val="666666"/>
-          <w:sz w:val="18"/>
-        </w:rPr>
-        <w:t>Page de connexion</w:t>
-      </w:r>
-    </w:p>
-    <w:p>
-      <w:pPr>
-        <w:pStyle w:val="Heading2"/>
-      </w:pPr>
-      <w:r>
-        <w:rPr>
-          <w:rFonts w:ascii="Calibri" w:hAnsi="Calibri"/>
-          <w:color w:val="14213D"/>
-        </w:rPr>
-        <w:t>3.3 Mot de passe oublié</w:t>
-      </w:r>
-    </w:p>
-    <w:p>
-      <w:pPr>
         <w:pStyle w:val="ListNumber"/>
-        <w:spacing w:after="80" w:line="240" w:lineRule="auto"/>
+        <w:spacing w:after="120" w:line="276" w:lineRule="auto"/>
       </w:pPr>
       <w:r>
         <w:rPr>
@@ -671,13 +816,13 @@
           <w:b w:val="0"/>
           <w:sz w:val="22"/>
         </w:rPr>
-        <w:t>1. « Mot de passe oublié ? » → saisir l'e-mail.</w:t>
+        <w:t>Ouvrez le lien reçu par e-mail (token à usage unique).</w:t>
       </w:r>
     </w:p>
     <w:p>
       <w:pPr>
         <w:pStyle w:val="ListNumber"/>
-        <w:spacing w:after="80" w:line="240" w:lineRule="auto"/>
+        <w:spacing w:after="120" w:line="276" w:lineRule="auto"/>
       </w:pPr>
       <w:r>
         <w:rPr>
@@ -685,13 +830,27 @@
           <w:b w:val="0"/>
           <w:sz w:val="22"/>
         </w:rPr>
-        <w:t>2. Ouvrir le lien reçu (token à usage unique, valide 60 min).</w:t>
+        <w:t>Définissez le nouveau mot de passe puis reconnectez-vous.</w:t>
       </w:r>
     </w:p>
     <w:p>
       <w:pPr>
+        <w:spacing w:before="200" w:after="120"/>
+      </w:pPr>
+      <w:r>
+        <w:rPr>
+          <w:rFonts w:ascii="Calibri Light" w:hAnsi="Calibri Light"/>
+          <w:b/>
+          <w:color w:val="14213D"/>
+          <w:sz w:val="26"/>
+        </w:rPr>
+        <w:t>3.4 Déconnexion</w:t>
+      </w:r>
+    </w:p>
+    <w:p>
+      <w:pPr>
         <w:pStyle w:val="ListNumber"/>
-        <w:spacing w:after="80" w:line="240" w:lineRule="auto"/>
+        <w:spacing w:after="120" w:line="276" w:lineRule="auto"/>
       </w:pPr>
       <w:r>
         <w:rPr>
@@ -699,25 +858,27 @@
           <w:b w:val="0"/>
           <w:sz w:val="22"/>
         </w:rPr>
-        <w:t>3. Définir le nouveau mot de passe → connexion.</w:t>
+        <w:t>Menu profil (icône utilisateur) → Déconnexion → Confirmer.</w:t>
       </w:r>
     </w:p>
     <w:p>
       <w:pPr>
-        <w:pStyle w:val="Heading2"/>
+        <w:spacing w:before="200" w:after="120"/>
       </w:pPr>
       <w:r>
         <w:rPr>
-          <w:rFonts w:ascii="Calibri" w:hAnsi="Calibri"/>
+          <w:rFonts w:ascii="Calibri Light" w:hAnsi="Calibri Light"/>
+          <w:b/>
           <w:color w:val="14213D"/>
+          <w:sz w:val="26"/>
         </w:rPr>
-        <w:t>3.4 Déconnexion</w:t>
+        <w:t>3.5 Sécurité</w:t>
       </w:r>
     </w:p>
     <w:p>
       <w:pPr>
-        <w:pStyle w:val="ListNumber"/>
-        <w:spacing w:after="80" w:line="240" w:lineRule="auto"/>
+        <w:pStyle w:val="ListBullet"/>
+        <w:spacing w:after="120" w:line="276" w:lineRule="auto"/>
       </w:pPr>
       <w:r>
         <w:rPr>
@@ -725,25 +886,13 @@
           <w:b w:val="0"/>
           <w:sz w:val="22"/>
         </w:rPr>
-        <w:t>1. Menu profil (avatar) → Déconnexion.</w:t>
+        <w:t>Utilisez un mot de passe unique et déconnectez-vous sur un poste partagé.</w:t>
       </w:r>
     </w:p>
     <w:p>
       <w:pPr>
-        <w:pStyle w:val="Heading2"/>
-      </w:pPr>
-      <w:r>
-        <w:rPr>
-          <w:rFonts w:ascii="Calibri" w:hAnsi="Calibri"/>
-          <w:color w:val="14213D"/>
-        </w:rPr>
-        <w:t>3.5 Sécurité</w:t>
-      </w:r>
-    </w:p>
-    <w:p>
-      <w:pPr>
         <w:pStyle w:val="ListBullet"/>
-        <w:spacing w:after="80" w:line="240" w:lineRule="auto"/>
+        <w:spacing w:after="120" w:line="276" w:lineRule="auto"/>
       </w:pPr>
       <w:r>
         <w:rPr>
@@ -751,13 +900,26 @@
           <w:b w:val="0"/>
           <w:sz w:val="22"/>
         </w:rPr>
-        <w:t>Mot de passe unique ; déconnexion sur poste partagé.</w:t>
+        <w:t>Le cadenas du tableau de bord permet de masquer les montants (voir §5.1).</w:t>
       </w:r>
     </w:p>
     <w:p>
       <w:pPr>
-        <w:pStyle w:val="ListBullet"/>
-        <w:spacing w:after="80" w:line="240" w:lineRule="auto"/>
+        <w:spacing w:before="280" w:after="120"/>
+      </w:pPr>
+      <w:r>
+        <w:rPr>
+          <w:rFonts w:ascii="Calibri Light" w:hAnsi="Calibri Light"/>
+          <w:b/>
+          <w:color w:val="14213D"/>
+          <w:sz w:val="32"/>
+        </w:rPr>
+        <w:t>4. Interface</w:t>
+      </w:r>
+    </w:p>
+    <w:p>
+      <w:pPr>
+        <w:spacing w:after="120" w:line="276" w:lineRule="auto"/>
       </w:pPr>
       <w:r>
         <w:rPr>
@@ -765,29 +927,44 @@
           <w:b w:val="0"/>
           <w:sz w:val="22"/>
         </w:rPr>
-        <w:t>Cadenas dashboard : voir §5.1.2.</w:t>
+        <w:t>Barre latérale : Tableau de bord, Factures, Devis, Clients, Rapports, Paramètres. En-tête : titre de page, logo, salutation et menu profil (Mon profil, Déconnexion).</w:t>
       </w:r>
     </w:p>
     <w:p>
       <w:r>
-        <w:br w:type="page"/>
+        <w:rPr>
+          <w:i/>
+          <w:sz w:val="20"/>
+        </w:rPr>
+        <w:t>[CAPTURE D'ÉCRAN — Interface principale]</w:t>
       </w:r>
     </w:p>
     <w:p>
-      <w:pPr>
-        <w:pStyle w:val="Heading1"/>
-      </w:pPr>
       <w:r>
         <w:rPr>
-          <w:rFonts w:ascii="Calibri" w:hAnsi="Calibri"/>
-          <w:color w:val="14213D"/>
+          <w:sz w:val="18"/>
         </w:rPr>
-        <w:t>4. Interface</w:t>
+        <w:t>Interface principale</w:t>
       </w:r>
     </w:p>
     <w:p>
       <w:pPr>
-        <w:spacing w:after="120" w:line="240" w:lineRule="auto"/>
+        <w:spacing w:before="200" w:after="120"/>
+      </w:pPr>
+      <w:r>
+        <w:rPr>
+          <w:rFonts w:ascii="Calibri Light" w:hAnsi="Calibri Light"/>
+          <w:b/>
+          <w:color w:val="14213D"/>
+          <w:sz w:val="26"/>
+        </w:rPr>
+        <w:t>4.1 Langue et fuseau horaire</w:t>
+      </w:r>
+    </w:p>
+    <w:p>
+      <w:pPr>
+        <w:pStyle w:val="ListNumber"/>
+        <w:spacing w:after="120" w:line="276" w:lineRule="auto"/>
       </w:pPr>
       <w:r>
         <w:rPr>
@@ -795,12 +972,40 @@
           <w:b w:val="0"/>
           <w:sz w:val="22"/>
         </w:rPr>
-        <w:t>Sidebar : Tableau de bord, Factures, Devis, Clients, Rapports, Paramètres.</w:t>
+        <w:t>Paramètres → Préférences : choisissez FR ou EN et le fuseau (Abidjan, Paris, UTC…).</w:t>
       </w:r>
     </w:p>
     <w:p>
       <w:pPr>
-        <w:spacing w:after="120" w:line="240" w:lineRule="auto"/>
+        <w:spacing w:before="280" w:after="120"/>
+      </w:pPr>
+      <w:r>
+        <w:rPr>
+          <w:rFonts w:ascii="Calibri Light" w:hAnsi="Calibri Light"/>
+          <w:b/>
+          <w:color w:val="14213D"/>
+          <w:sz w:val="32"/>
+        </w:rPr>
+        <w:t>5. Fonctionnalités</w:t>
+      </w:r>
+    </w:p>
+    <w:p>
+      <w:pPr>
+        <w:spacing w:before="200" w:after="120"/>
+      </w:pPr>
+      <w:r>
+        <w:rPr>
+          <w:rFonts w:ascii="Calibri Light" w:hAnsi="Calibri Light"/>
+          <w:b/>
+          <w:color w:val="14213D"/>
+          <w:sz w:val="26"/>
+        </w:rPr>
+        <w:t>5.1 Tableau de bord</w:t>
+      </w:r>
+    </w:p>
+    <w:p>
+      <w:pPr>
+        <w:spacing w:after="120" w:line="276" w:lineRule="auto"/>
       </w:pPr>
       <w:r>
         <w:rPr>
@@ -808,61 +1013,27 @@
           <w:b w:val="0"/>
           <w:sz w:val="22"/>
         </w:rPr>
-        <w:t>Header : titre, badge plan, menu profil (Mon profil, Abonnement, Déconnexion).</w:t>
+        <w:t>Indicateurs : chiffre d'affaires encaissé, encours clients, taux de recouvrement, facture moyenne payée, clients actifs, factures en retard. Graphique CA sur 6 mois. Listes des devis et factures récents.</w:t>
       </w:r>
     </w:p>
     <w:p>
       <w:pPr>
-        <w:jc w:val="center"/>
-        <w:pBdr>
-          <w:top w:val="single" w:sz="4" w:space="4" w:color="FCA311"/>
-          <w:left w:val="single" w:sz="4" w:space="4" w:color="FCA311"/>
-          <w:bottom w:val="single" w:sz="4" w:space="4" w:color="FCA311"/>
-          <w:right w:val="single" w:sz="4" w:space="4" w:color="FCA311"/>
-        </w:pBdr>
+        <w:spacing w:before="200" w:after="120"/>
       </w:pPr>
       <w:r>
         <w:rPr>
-          <w:rFonts w:ascii="Calibri" w:hAnsi="Calibri"/>
+          <w:rFonts w:ascii="Calibri Light" w:hAnsi="Calibri Light"/>
           <w:b/>
-          <w:i/>
-          <w:color w:val="FCA311"/>
-          <w:sz w:val="20"/>
+          <w:color w:val="14213D"/>
+          <w:sz w:val="24"/>
         </w:rPr>
-        <w:t>[CAPTURE D'ÉCRAN — Interface principale]</w:t>
+        <w:t>5.1.1 Afficher ou masquer les montants</w:t>
       </w:r>
     </w:p>
     <w:p>
       <w:pPr>
-        <w:spacing w:after="200" w:line="240" w:lineRule="auto"/>
-        <w:jc w:val="center"/>
-      </w:pPr>
-      <w:r>
-        <w:rPr>
-          <w:rFonts w:ascii="Calibri" w:hAnsi="Calibri"/>
-          <w:b w:val="0"/>
-          <w:color w:val="666666"/>
-          <w:sz w:val="18"/>
-        </w:rPr>
-        <w:t>Interface principale</w:t>
-      </w:r>
-    </w:p>
-    <w:p>
-      <w:pPr>
-        <w:pStyle w:val="Heading2"/>
-      </w:pPr>
-      <w:r>
-        <w:rPr>
-          <w:rFonts w:ascii="Calibri" w:hAnsi="Calibri"/>
-          <w:color w:val="14213D"/>
-        </w:rPr>
-        <w:t>4.1 Langue et fuseau</w:t>
-      </w:r>
-    </w:p>
-    <w:p>
-      <w:pPr>
         <w:pStyle w:val="ListNumber"/>
-        <w:spacing w:after="80" w:line="240" w:lineRule="auto"/>
+        <w:spacing w:after="120" w:line="276" w:lineRule="auto"/>
       </w:pPr>
       <w:r>
         <w:rPr>
@@ -870,41 +1041,13 @@
           <w:b w:val="0"/>
           <w:sz w:val="22"/>
         </w:rPr>
-        <w:t>1. Paramètres → Préférences : FR/EN et fuseau (Abidjan, Paris, UTC…).</w:t>
+        <w:t>Cliquez le cadenas → saisissez votre mot de passe → Valider.</w:t>
       </w:r>
     </w:p>
     <w:p>
-      <w:r>
-        <w:br w:type="page"/>
-      </w:r>
-    </w:p>
-    <w:p>
-      <w:pPr>
-        <w:pStyle w:val="Heading1"/>
-      </w:pPr>
-      <w:r>
-        <w:rPr>
-          <w:rFonts w:ascii="Calibri" w:hAnsi="Calibri"/>
-          <w:color w:val="14213D"/>
-        </w:rPr>
-        <w:t>5. Fonctionnalités</w:t>
-      </w:r>
-    </w:p>
-    <w:p>
-      <w:pPr>
-        <w:pStyle w:val="Heading2"/>
-      </w:pPr>
-      <w:r>
-        <w:rPr>
-          <w:rFonts w:ascii="Calibri" w:hAnsi="Calibri"/>
-          <w:color w:val="14213D"/>
-        </w:rPr>
-        <w:t>5.1 Tableau de bord</w:t>
-      </w:r>
-    </w:p>
-    <w:p>
-      <w:pPr>
-        <w:spacing w:after="120" w:line="240" w:lineRule="auto"/>
+      <w:pPr>
+        <w:pStyle w:val="ListNumber"/>
+        <w:spacing w:after="120" w:line="276" w:lineRule="auto"/>
       </w:pPr>
       <w:r>
         <w:rPr>
@@ -912,13 +1055,27 @@
           <w:b w:val="0"/>
           <w:sz w:val="22"/>
         </w:rPr>
-        <w:t>KPI : CA encaissé (somme des paiements), encours, recouvrement, factures en retard…</w:t>
+        <w:t>Les montants restent visibles pour la session en cours.</w:t>
       </w:r>
     </w:p>
     <w:p>
       <w:pPr>
+        <w:spacing w:before="200" w:after="120"/>
+      </w:pPr>
+      <w:r>
+        <w:rPr>
+          <w:rFonts w:ascii="Calibri Light" w:hAnsi="Calibri Light"/>
+          <w:b/>
+          <w:color w:val="14213D"/>
+          <w:sz w:val="24"/>
+        </w:rPr>
+        <w:t>5.1.2 Export CSV des revenus</w:t>
+      </w:r>
+    </w:p>
+    <w:p>
+      <w:pPr>
         <w:pStyle w:val="ListNumber"/>
-        <w:spacing w:after="80" w:line="240" w:lineRule="auto"/>
+        <w:spacing w:after="120" w:line="276" w:lineRule="auto"/>
       </w:pPr>
       <w:r>
         <w:rPr>
@@ -926,13 +1083,44 @@
           <w:b w:val="0"/>
           <w:sz w:val="22"/>
         </w:rPr>
-        <w:t>1. Cadenas : saisir le mot de passe pour afficher les montants (§5.1.2).</w:t>
+        <w:t>Bouton « Exporter CSV » : télécharge les paiements enregistrés sur la période.</w:t>
       </w:r>
     </w:p>
     <w:p>
+      <w:r>
+        <w:rPr>
+          <w:i/>
+          <w:sz w:val="20"/>
+        </w:rPr>
+        <w:t>[CAPTURE D'ÉCRAN — Tableau de bord]</w:t>
+      </w:r>
+    </w:p>
+    <w:p>
+      <w:r>
+        <w:rPr>
+          <w:sz w:val="18"/>
+        </w:rPr>
+        <w:t>Tableau de bord</w:t>
+      </w:r>
+    </w:p>
+    <w:p>
+      <w:pPr>
+        <w:spacing w:before="200" w:after="120"/>
+      </w:pPr>
+      <w:r>
+        <w:rPr>
+          <w:rFonts w:ascii="Calibri Light" w:hAnsi="Calibri Light"/>
+          <w:b/>
+          <w:color w:val="14213D"/>
+          <w:sz w:val="26"/>
+        </w:rPr>
+        <w:t>5.2 Clients</w:t>
+      </w:r>
+    </w:p>
+    <w:p>
       <w:pPr>
         <w:pStyle w:val="ListNumber"/>
-        <w:spacing w:after="80" w:line="240" w:lineRule="auto"/>
+        <w:spacing w:after="120" w:line="276" w:lineRule="auto"/>
       </w:pPr>
       <w:r>
         <w:rPr>
@@ -940,61 +1128,13 @@
           <w:b w:val="0"/>
           <w:sz w:val="22"/>
         </w:rPr>
-        <w:t>2. Export CSV : réservé Pro (§5.1.3).</w:t>
+        <w:t>Nouveau client : prénom, nom, société, e-mail, téléphone, adresse, identifiant fiscal, notes.</w:t>
       </w:r>
     </w:p>
     <w:p>
       <w:pPr>
-        <w:jc w:val="center"/>
-        <w:pBdr>
-          <w:top w:val="single" w:sz="4" w:space="4" w:color="FCA311"/>
-          <w:left w:val="single" w:sz="4" w:space="4" w:color="FCA311"/>
-          <w:bottom w:val="single" w:sz="4" w:space="4" w:color="FCA311"/>
-          <w:right w:val="single" w:sz="4" w:space="4" w:color="FCA311"/>
-        </w:pBdr>
-      </w:pPr>
-      <w:r>
-        <w:rPr>
-          <w:rFonts w:ascii="Calibri" w:hAnsi="Calibri"/>
-          <w:b/>
-          <w:i/>
-          <w:color w:val="FCA311"/>
-          <w:sz w:val="20"/>
-        </w:rPr>
-        <w:t>[CAPTURE D'ÉCRAN — Tableau de bord]</w:t>
-      </w:r>
-    </w:p>
-    <w:p>
-      <w:pPr>
-        <w:spacing w:after="200" w:line="240" w:lineRule="auto"/>
-        <w:jc w:val="center"/>
-      </w:pPr>
-      <w:r>
-        <w:rPr>
-          <w:rFonts w:ascii="Calibri" w:hAnsi="Calibri"/>
-          <w:b w:val="0"/>
-          <w:color w:val="666666"/>
-          <w:sz w:val="18"/>
-        </w:rPr>
-        <w:t>Tableau de bord</w:t>
-      </w:r>
-    </w:p>
-    <w:p>
-      <w:pPr>
-        <w:pStyle w:val="Heading2"/>
-      </w:pPr>
-      <w:r>
-        <w:rPr>
-          <w:rFonts w:ascii="Calibri" w:hAnsi="Calibri"/>
-          <w:color w:val="14213D"/>
-        </w:rPr>
-        <w:t>5.1.2 Déverrouiller les montants</w:t>
-      </w:r>
-    </w:p>
-    <w:p>
-      <w:pPr>
         <w:pStyle w:val="ListNumber"/>
-        <w:spacing w:after="80" w:line="240" w:lineRule="auto"/>
+        <w:spacing w:after="120" w:line="276" w:lineRule="auto"/>
       </w:pPr>
       <w:r>
         <w:rPr>
@@ -1002,25 +1142,13 @@
           <w:b w:val="0"/>
           <w:sz w:val="22"/>
         </w:rPr>
-        <w:t>1. Cliquez le cadenas → mot de passe → Valider.</w:t>
+        <w:t>Recherche textuelle sur la liste.</w:t>
       </w:r>
     </w:p>
     <w:p>
       <w:pPr>
-        <w:pStyle w:val="Heading2"/>
-      </w:pPr>
-      <w:r>
-        <w:rPr>
-          <w:rFonts w:ascii="Calibri" w:hAnsi="Calibri"/>
-          <w:color w:val="14213D"/>
-        </w:rPr>
-        <w:t>5.1.3 Export CSV (Pro)</w:t>
-      </w:r>
-    </w:p>
-    <w:p>
-      <w:pPr>
         <w:pStyle w:val="ListNumber"/>
-        <w:spacing w:after="80" w:line="240" w:lineRule="auto"/>
+        <w:spacing w:after="120" w:line="276" w:lineRule="auto"/>
       </w:pPr>
       <w:r>
         <w:rPr>
@@ -1028,25 +1156,13 @@
           <w:b w:val="0"/>
           <w:sz w:val="22"/>
         </w:rPr>
-        <w:t>1. Bouton « Exporter CSV » sur le dashboard.</w:t>
+        <w:t>Import CSV : bouton « Import CSV » (fichier avec en-têtes compatibles).</w:t>
       </w:r>
     </w:p>
     <w:p>
       <w:pPr>
-        <w:pStyle w:val="Heading2"/>
-      </w:pPr>
-      <w:r>
-        <w:rPr>
-          <w:rFonts w:ascii="Calibri" w:hAnsi="Calibri"/>
-          <w:color w:val="14213D"/>
-        </w:rPr>
-        <w:t>5.2 Clients</w:t>
-      </w:r>
-    </w:p>
-    <w:p>
-      <w:pPr>
         <w:pStyle w:val="ListNumber"/>
-        <w:spacing w:after="80" w:line="240" w:lineRule="auto"/>
+        <w:spacing w:after="120" w:line="276" w:lineRule="auto"/>
       </w:pPr>
       <w:r>
         <w:rPr>
@@ -1054,13 +1170,44 @@
           <w:b w:val="0"/>
           <w:sz w:val="22"/>
         </w:rPr>
-        <w:t>1. Nouveau client : prénom, nom, société, e-mail, téléphone, adresse, NIF, notes.</w:t>
+        <w:t>Historique : consulter les devis et factures liés à un client.</w:t>
       </w:r>
     </w:p>
     <w:p>
+      <w:r>
+        <w:rPr>
+          <w:i/>
+          <w:sz w:val="20"/>
+        </w:rPr>
+        <w:t>[CAPTURE D'ÉCRAN — Liste clients]</w:t>
+      </w:r>
+    </w:p>
+    <w:p>
+      <w:r>
+        <w:rPr>
+          <w:sz w:val="18"/>
+        </w:rPr>
+        <w:t>Liste clients</w:t>
+      </w:r>
+    </w:p>
+    <w:p>
+      <w:pPr>
+        <w:spacing w:before="200" w:after="120"/>
+      </w:pPr>
+      <w:r>
+        <w:rPr>
+          <w:rFonts w:ascii="Calibri Light" w:hAnsi="Calibri Light"/>
+          <w:b/>
+          <w:color w:val="14213D"/>
+          <w:sz w:val="26"/>
+        </w:rPr>
+        <w:t>5.3 Devis</w:t>
+      </w:r>
+    </w:p>
+    <w:p>
       <w:pPr>
         <w:pStyle w:val="ListNumber"/>
-        <w:spacing w:after="80" w:line="240" w:lineRule="auto"/>
+        <w:spacing w:after="120" w:line="276" w:lineRule="auto"/>
       </w:pPr>
       <w:r>
         <w:rPr>
@@ -1068,61 +1215,13 @@
           <w:b w:val="0"/>
           <w:sz w:val="22"/>
         </w:rPr>
-        <w:t>2. Import CSV : offre Pro.</w:t>
+        <w:t>Devises : XOF (défaut), EUR, USD, GBP.</w:t>
       </w:r>
     </w:p>
     <w:p>
       <w:pPr>
-        <w:jc w:val="center"/>
-        <w:pBdr>
-          <w:top w:val="single" w:sz="4" w:space="4" w:color="FCA311"/>
-          <w:left w:val="single" w:sz="4" w:space="4" w:color="FCA311"/>
-          <w:bottom w:val="single" w:sz="4" w:space="4" w:color="FCA311"/>
-          <w:right w:val="single" w:sz="4" w:space="4" w:color="FCA311"/>
-        </w:pBdr>
-      </w:pPr>
-      <w:r>
-        <w:rPr>
-          <w:rFonts w:ascii="Calibri" w:hAnsi="Calibri"/>
-          <w:b/>
-          <w:i/>
-          <w:color w:val="FCA311"/>
-          <w:sz w:val="20"/>
-        </w:rPr>
-        <w:t>[CAPTURE D'ÉCRAN — Liste clients]</w:t>
-      </w:r>
-    </w:p>
-    <w:p>
-      <w:pPr>
-        <w:spacing w:after="200" w:line="240" w:lineRule="auto"/>
-        <w:jc w:val="center"/>
-      </w:pPr>
-      <w:r>
-        <w:rPr>
-          <w:rFonts w:ascii="Calibri" w:hAnsi="Calibri"/>
-          <w:b w:val="0"/>
-          <w:color w:val="666666"/>
-          <w:sz w:val="18"/>
-        </w:rPr>
-        <w:t>Liste clients</w:t>
-      </w:r>
-    </w:p>
-    <w:p>
-      <w:pPr>
-        <w:pStyle w:val="Heading2"/>
-      </w:pPr>
-      <w:r>
-        <w:rPr>
-          <w:rFonts w:ascii="Calibri" w:hAnsi="Calibri"/>
-          <w:color w:val="14213D"/>
-        </w:rPr>
-        <w:t>5.3 Devis</w:t>
-      </w:r>
-    </w:p>
-    <w:p>
-      <w:pPr>
         <w:pStyle w:val="ListNumber"/>
-        <w:spacing w:after="80" w:line="240" w:lineRule="auto"/>
+        <w:spacing w:after="120" w:line="276" w:lineRule="auto"/>
       </w:pPr>
       <w:r>
         <w:rPr>
@@ -1130,13 +1229,13 @@
           <w:b w:val="0"/>
           <w:sz w:val="22"/>
         </w:rPr>
-        <w:t>1. Devises : XOF, EUR, USD, GBP.</w:t>
+        <w:t>Ajoutez des lignes : description, quantité, prix unitaire HT, taux TVA.</w:t>
       </w:r>
     </w:p>
     <w:p>
       <w:pPr>
         <w:pStyle w:val="ListNumber"/>
-        <w:spacing w:after="80" w:line="240" w:lineRule="auto"/>
+        <w:spacing w:after="120" w:line="276" w:lineRule="auto"/>
       </w:pPr>
       <w:r>
         <w:rPr>
@@ -1144,13 +1243,13 @@
           <w:b w:val="0"/>
           <w:sz w:val="22"/>
         </w:rPr>
-        <w:t>2. Statuts : Brouillon → Envoyé → Accepté / Refusé / Expiré.</w:t>
+        <w:t>Remise globale en pourcentage optionnelle.</w:t>
       </w:r>
     </w:p>
     <w:p>
       <w:pPr>
         <w:pStyle w:val="ListNumber"/>
-        <w:spacing w:after="80" w:line="240" w:lineRule="auto"/>
+        <w:spacing w:after="120" w:line="276" w:lineRule="auto"/>
       </w:pPr>
       <w:r>
         <w:rPr>
@@ -1158,40 +1257,49 @@
           <w:b w:val="0"/>
           <w:sz w:val="22"/>
         </w:rPr>
-        <w:t>3. Conversion en facture : devis Accepté uniquement → facture brouillon.</w:t>
+        <w:t>Statuts : Brouillon → Envoyé → Accepté / Refusé / Expiré.</w:t>
       </w:r>
     </w:p>
     <w:p>
       <w:pPr>
-        <w:jc w:val="center"/>
-        <w:pBdr>
-          <w:top w:val="single" w:sz="4" w:space="4" w:color="FCA311"/>
-          <w:left w:val="single" w:sz="4" w:space="4" w:color="FCA311"/>
-          <w:bottom w:val="single" w:sz="4" w:space="4" w:color="FCA311"/>
-          <w:right w:val="single" w:sz="4" w:space="4" w:color="FCA311"/>
-        </w:pBdr>
+        <w:pStyle w:val="ListNumber"/>
+        <w:spacing w:after="120" w:line="276" w:lineRule="auto"/>
       </w:pPr>
       <w:r>
         <w:rPr>
           <w:rFonts w:ascii="Calibri" w:hAnsi="Calibri"/>
-          <w:b/>
+          <w:b w:val="0"/>
+          <w:sz w:val="22"/>
+        </w:rPr>
+        <w:t>Conversion en facture : uniquement si le devis est Accepté → facture brouillon créée.</w:t>
+      </w:r>
+    </w:p>
+    <w:p>
+      <w:pPr>
+        <w:pStyle w:val="ListNumber"/>
+        <w:spacing w:after="120" w:line="276" w:lineRule="auto"/>
+      </w:pPr>
+      <w:r>
+        <w:rPr>
+          <w:rFonts w:ascii="Calibri" w:hAnsi="Calibri"/>
+          <w:b w:val="0"/>
+          <w:sz w:val="22"/>
+        </w:rPr>
+        <w:t>Aperçu et téléchargement PDF disponibles.</w:t>
+      </w:r>
+    </w:p>
+    <w:p>
+      <w:r>
+        <w:rPr>
           <w:i/>
-          <w:color w:val="FCA311"/>
           <w:sz w:val="20"/>
         </w:rPr>
         <w:t>[CAPTURE D'ÉCRAN — Formulaire devis]</w:t>
       </w:r>
     </w:p>
     <w:p>
-      <w:pPr>
-        <w:spacing w:after="200" w:line="240" w:lineRule="auto"/>
-        <w:jc w:val="center"/>
-      </w:pPr>
       <w:r>
         <w:rPr>
-          <w:rFonts w:ascii="Calibri" w:hAnsi="Calibri"/>
-          <w:b w:val="0"/>
-          <w:color w:val="666666"/>
           <w:sz w:val="18"/>
         </w:rPr>
         <w:t>Formulaire devis</w:t>
@@ -1199,12 +1307,14 @@
     </w:p>
     <w:p>
       <w:pPr>
-        <w:pStyle w:val="Heading2"/>
+        <w:spacing w:before="200" w:after="120"/>
       </w:pPr>
       <w:r>
         <w:rPr>
-          <w:rFonts w:ascii="Calibri" w:hAnsi="Calibri"/>
+          <w:rFonts w:ascii="Calibri Light" w:hAnsi="Calibri Light"/>
+          <w:b/>
           <w:color w:val="14213D"/>
+          <w:sz w:val="26"/>
         </w:rPr>
         <w:t>5.4 Factures et avoirs</w:t>
       </w:r>
@@ -1212,7 +1322,7 @@
     <w:p>
       <w:pPr>
         <w:pStyle w:val="ListNumber"/>
-        <w:spacing w:after="80" w:line="240" w:lineRule="auto"/>
+        <w:spacing w:after="120" w:line="276" w:lineRule="auto"/>
       </w:pPr>
       <w:r>
         <w:rPr>
@@ -1220,13 +1330,13 @@
           <w:b w:val="0"/>
           <w:sz w:val="22"/>
         </w:rPr>
-        <w:t>1. Statuts : Brouillon → Envoyée → Payée / En retard / Annulée.</w:t>
+        <w:t>Statuts : Brouillon → Envoyée → Payée / En retard / Annulée.</w:t>
       </w:r>
     </w:p>
     <w:p>
       <w:pPr>
         <w:pStyle w:val="ListNumber"/>
-        <w:spacing w:after="80" w:line="240" w:lineRule="auto"/>
+        <w:spacing w:after="120" w:line="276" w:lineRule="auto"/>
       </w:pPr>
       <w:r>
         <w:rPr>
@@ -1234,13 +1344,13 @@
           <w:b w:val="0"/>
           <w:sz w:val="22"/>
         </w:rPr>
-        <w:t>2. Paiements partiels manuels (virement, espèces, mobile money…).</w:t>
+        <w:t>Enregistrement manuel des paiements (montant, méthode, référence, date) — paiements partiels possibles.</w:t>
       </w:r>
     </w:p>
     <w:p>
       <w:pPr>
         <w:pStyle w:val="ListNumber"/>
-        <w:spacing w:after="80" w:line="240" w:lineRule="auto"/>
+        <w:spacing w:after="120" w:line="276" w:lineRule="auto"/>
       </w:pPr>
       <w:r>
         <w:rPr>
@@ -1248,13 +1358,13 @@
           <w:b w:val="0"/>
           <w:sz w:val="22"/>
         </w:rPr>
-        <w:t>3. Avoir : action « Créer un avoir » sur facture émise — annulation totale, irréversible.</w:t>
+        <w:t>Avoir : action « Créer un avoir » sur une facture émise (irrversible).</w:t>
       </w:r>
     </w:p>
     <w:p>
       <w:pPr>
         <w:pStyle w:val="ListNumber"/>
-        <w:spacing w:after="80" w:line="240" w:lineRule="auto"/>
+        <w:spacing w:after="120" w:line="276" w:lineRule="auto"/>
       </w:pPr>
       <w:r>
         <w:rPr>
@@ -1262,13 +1372,13 @@
           <w:b w:val="0"/>
           <w:sz w:val="22"/>
         </w:rPr>
-        <w:t>4. Onglet Avoirs dans la page Factures.</w:t>
+        <w:t>Onglet Avoirs dans la page Factures.</w:t>
       </w:r>
     </w:p>
     <w:p>
       <w:pPr>
         <w:pStyle w:val="ListNumber"/>
-        <w:spacing w:after="80" w:line="240" w:lineRule="auto"/>
+        <w:spacing w:after="120" w:line="276" w:lineRule="auto"/>
       </w:pPr>
       <w:r>
         <w:rPr>
@@ -1276,62 +1386,35 @@
           <w:b w:val="0"/>
           <w:sz w:val="22"/>
         </w:rPr>
-        <w:t>5. Historique d'activité : aperçu et PDF historique disponibles.</w:t>
+        <w:t>Historique d'activité : aperçu HTML et PDF historique.</w:t>
       </w:r>
     </w:p>
     <w:p>
       <w:pPr>
-        <w:spacing w:after="160" w:line="240" w:lineRule="auto"/>
-      </w:pPr>
-      <w:r>
-        <w:rPr>
-          <w:rFonts w:ascii="Calibri" w:hAnsi="Calibri"/>
-          <w:b w:val="0"/>
-          <w:color w:val="14213D"/>
-          <w:sz w:val="22"/>
-        </w:rPr>
-        <w:t xml:space="preserve">Limite Gratuit — </w:t>
-      </w:r>
+        <w:pStyle w:val="ListNumber"/>
+        <w:spacing w:after="120" w:line="276" w:lineRule="auto"/>
+      </w:pPr>
       <w:r>
         <w:rPr>
           <w:rFonts w:ascii="Calibri" w:hAnsi="Calibri"/>
           <w:b w:val="0"/>
           <w:sz w:val="22"/>
         </w:rPr>
-        <w:t>10 factures/mois calendaires.</w:t>
+        <w:t>Aperçu et téléchargement PDF du document.</w:t>
       </w:r>
     </w:p>
     <w:p>
-      <w:pPr>
-        <w:jc w:val="center"/>
-        <w:pBdr>
-          <w:top w:val="single" w:sz="4" w:space="4" w:color="FCA311"/>
-          <w:left w:val="single" w:sz="4" w:space="4" w:color="FCA311"/>
-          <w:bottom w:val="single" w:sz="4" w:space="4" w:color="FCA311"/>
-          <w:right w:val="single" w:sz="4" w:space="4" w:color="FCA311"/>
-        </w:pBdr>
-      </w:pPr>
       <w:r>
         <w:rPr>
-          <w:rFonts w:ascii="Calibri" w:hAnsi="Calibri"/>
-          <w:b/>
           <w:i/>
-          <w:color w:val="FCA311"/>
           <w:sz w:val="20"/>
         </w:rPr>
         <w:t>[CAPTURE D'ÉCRAN — Liste factures]</w:t>
       </w:r>
     </w:p>
     <w:p>
-      <w:pPr>
-        <w:spacing w:after="200" w:line="240" w:lineRule="auto"/>
-        <w:jc w:val="center"/>
-      </w:pPr>
       <w:r>
         <w:rPr>
-          <w:rFonts w:ascii="Calibri" w:hAnsi="Calibri"/>
-          <w:b w:val="0"/>
-          <w:color w:val="666666"/>
           <w:sz w:val="18"/>
         </w:rPr>
         <w:t>Liste factures</w:t>
@@ -1339,12 +1422,14 @@
     </w:p>
     <w:p>
       <w:pPr>
-        <w:pStyle w:val="Heading2"/>
+        <w:spacing w:before="200" w:after="120"/>
       </w:pPr>
       <w:r>
         <w:rPr>
-          <w:rFonts w:ascii="Calibri" w:hAnsi="Calibri"/>
+          <w:rFonts w:ascii="Calibri Light" w:hAnsi="Calibri Light"/>
+          <w:b/>
           <w:color w:val="14213D"/>
+          <w:sz w:val="26"/>
         </w:rPr>
         <w:t>5.5 Rapports</w:t>
       </w:r>
@@ -1352,7 +1437,7 @@
     <w:p>
       <w:pPr>
         <w:pStyle w:val="ListNumber"/>
-        <w:spacing w:after="80" w:line="240" w:lineRule="auto"/>
+        <w:spacing w:after="120" w:line="276" w:lineRule="auto"/>
       </w:pPr>
       <w:r>
         <w:rPr>
@@ -1360,13 +1445,13 @@
           <w:b w:val="0"/>
           <w:sz w:val="22"/>
         </w:rPr>
-        <w:t>1. Période : mois, trimestre, année.</w:t>
+        <w:t>Page /app/rapports — période : mois, trimestre ou année.</w:t>
       </w:r>
     </w:p>
     <w:p>
       <w:pPr>
         <w:pStyle w:val="ListNumber"/>
-        <w:spacing w:after="80" w:line="240" w:lineRule="auto"/>
+        <w:spacing w:after="120" w:line="276" w:lineRule="auto"/>
       </w:pPr>
       <w:r>
         <w:rPr>
@@ -1374,13 +1459,13 @@
           <w:b w:val="0"/>
           <w:sz w:val="22"/>
         </w:rPr>
-        <w:t>2. Aging et top clients : Pro.</w:t>
+        <w:t>Indicateurs : revenus encaissés, encours, conversion devis, top clients.</w:t>
       </w:r>
     </w:p>
     <w:p>
       <w:pPr>
         <w:pStyle w:val="ListNumber"/>
-        <w:spacing w:after="80" w:line="240" w:lineRule="auto"/>
+        <w:spacing w:after="120" w:line="276" w:lineRule="auto"/>
       </w:pPr>
       <w:r>
         <w:rPr>
@@ -1388,40 +1473,21 @@
           <w:b w:val="0"/>
           <w:sz w:val="22"/>
         </w:rPr>
-        <w:t>3. Export CSV via le même endpoint que le dashboard (Pro).</w:t>
+        <w:t>Liste des factures en retard et vieillissement des impayés (0-30, 31-60, 61+ jours).</w:t>
       </w:r>
     </w:p>
     <w:p>
-      <w:pPr>
-        <w:jc w:val="center"/>
-        <w:pBdr>
-          <w:top w:val="single" w:sz="4" w:space="4" w:color="FCA311"/>
-          <w:left w:val="single" w:sz="4" w:space="4" w:color="FCA311"/>
-          <w:bottom w:val="single" w:sz="4" w:space="4" w:color="FCA311"/>
-          <w:right w:val="single" w:sz="4" w:space="4" w:color="FCA311"/>
-        </w:pBdr>
-      </w:pPr>
       <w:r>
         <w:rPr>
-          <w:rFonts w:ascii="Calibri" w:hAnsi="Calibri"/>
-          <w:b/>
           <w:i/>
-          <w:color w:val="FCA311"/>
           <w:sz w:val="20"/>
         </w:rPr>
         <w:t>[CAPTURE D'ÉCRAN — Page Rapports]</w:t>
       </w:r>
     </w:p>
     <w:p>
-      <w:pPr>
-        <w:spacing w:after="200" w:line="240" w:lineRule="auto"/>
-        <w:jc w:val="center"/>
-      </w:pPr>
       <w:r>
         <w:rPr>
-          <w:rFonts w:ascii="Calibri" w:hAnsi="Calibri"/>
-          <w:b w:val="0"/>
-          <w:color w:val="666666"/>
           <w:sz w:val="18"/>
         </w:rPr>
         <w:t>Page Rapports</w:t>
@@ -1429,12 +1495,14 @@
     </w:p>
     <w:p>
       <w:pPr>
-        <w:pStyle w:val="Heading2"/>
+        <w:spacing w:before="200" w:after="120"/>
       </w:pPr>
       <w:r>
         <w:rPr>
-          <w:rFonts w:ascii="Calibri" w:hAnsi="Calibri"/>
+          <w:rFonts w:ascii="Calibri Light" w:hAnsi="Calibri Light"/>
+          <w:b/>
           <w:color w:val="14213D"/>
+          <w:sz w:val="26"/>
         </w:rPr>
         <w:t>5.6 Paramètres</w:t>
       </w:r>
@@ -1442,7 +1510,7 @@
     <w:p>
       <w:pPr>
         <w:pStyle w:val="ListNumber"/>
-        <w:spacing w:after="80" w:line="240" w:lineRule="auto"/>
+        <w:spacing w:after="120" w:line="276" w:lineRule="auto"/>
       </w:pPr>
       <w:r>
         <w:rPr>
@@ -1450,13 +1518,13 @@
           <w:b w:val="0"/>
           <w:sz w:val="22"/>
         </w:rPr>
-        <w:t>1. Entreprise, NIF, IBAN/BIC, mentions légales, logo, couleurs PDF.</w:t>
+        <w:t>Entreprise : raison sociale, adresse, téléphone, e-mail, NIF, IBAN/BIC, mentions légales, logo, couleurs PDF.</w:t>
       </w:r>
     </w:p>
     <w:p>
       <w:pPr>
         <w:pStyle w:val="ListNumber"/>
-        <w:spacing w:after="80" w:line="240" w:lineRule="auto"/>
+        <w:spacing w:after="120" w:line="276" w:lineRule="auto"/>
       </w:pPr>
       <w:r>
         <w:rPr>
@@ -1464,13 +1532,13 @@
           <w:b w:val="0"/>
           <w:sz w:val="22"/>
         </w:rPr>
-        <w:t>2. Sécurité : changement de mot de passe (pas dans Mon profil).</w:t>
+        <w:t>Préférences : langue, fuseau horaire, notifications e-mail (relances factures en retard).</w:t>
       </w:r>
     </w:p>
     <w:p>
       <w:pPr>
         <w:pStyle w:val="ListNumber"/>
-        <w:spacing w:after="80" w:line="240" w:lineRule="auto"/>
+        <w:spacing w:after="120" w:line="276" w:lineRule="auto"/>
       </w:pPr>
       <w:r>
         <w:rPr>
@@ -1478,62 +1546,48 @@
           <w:b w:val="0"/>
           <w:sz w:val="22"/>
         </w:rPr>
-        <w:t>3. Préférences : notifications e-mail pour relances hebdomadaires (lundi 8 h).</w:t>
+        <w:t>Sécurité : changement de mot de passe.</w:t>
       </w:r>
     </w:p>
     <w:p>
       <w:pPr>
-        <w:spacing w:after="160" w:line="240" w:lineRule="auto"/>
-      </w:pPr>
-      <w:r>
-        <w:rPr>
-          <w:rFonts w:ascii="Calibri" w:hAnsi="Calibri"/>
-          <w:b w:val="0"/>
-          <w:color w:val="14213D"/>
-          <w:sz w:val="22"/>
-        </w:rPr>
-        <w:t xml:space="preserve">Relances — </w:t>
-      </w:r>
+        <w:pStyle w:val="ListNumber"/>
+        <w:spacing w:after="120" w:line="276" w:lineRule="auto"/>
+      </w:pPr>
       <w:r>
         <w:rPr>
           <w:rFonts w:ascii="Calibri" w:hAnsi="Calibri"/>
           <w:b w:val="0"/>
           <w:sz w:val="22"/>
         </w:rPr>
-        <w:t>Disponibles pour tous les plans si notifications e-mail activées (pas réservé Pro).</w:t>
+        <w:t>Confidentialité : masquer/afficher les montants sensibles.</w:t>
       </w:r>
     </w:p>
     <w:p>
       <w:pPr>
-        <w:jc w:val="center"/>
-        <w:pBdr>
-          <w:top w:val="single" w:sz="4" w:space="4" w:color="FCA311"/>
-          <w:left w:val="single" w:sz="4" w:space="4" w:color="FCA311"/>
-          <w:bottom w:val="single" w:sz="4" w:space="4" w:color="FCA311"/>
-          <w:right w:val="single" w:sz="4" w:space="4" w:color="FCA311"/>
-        </w:pBdr>
+        <w:spacing w:after="120" w:line="276" w:lineRule="auto"/>
       </w:pPr>
       <w:r>
         <w:rPr>
           <w:rFonts w:ascii="Calibri" w:hAnsi="Calibri"/>
-          <w:b/>
+          <w:b w:val="0"/>
+          <w:sz w:val="22"/>
+        </w:rPr>
+        <w:t>Relances e-mail : envoyées le lundi à 8 h si notifications activées et factures en retard présentes (tâche planifiée documents:update-statuses --remind).</w:t>
+      </w:r>
+    </w:p>
+    <w:p>
+      <w:r>
+        <w:rPr>
           <w:i/>
-          <w:color w:val="FCA311"/>
           <w:sz w:val="20"/>
         </w:rPr>
         <w:t>[CAPTURE D'ÉCRAN — Paramètres]</w:t>
       </w:r>
     </w:p>
     <w:p>
-      <w:pPr>
-        <w:spacing w:after="200" w:line="240" w:lineRule="auto"/>
-        <w:jc w:val="center"/>
-      </w:pPr>
       <w:r>
         <w:rPr>
-          <w:rFonts w:ascii="Calibri" w:hAnsi="Calibri"/>
-          <w:b w:val="0"/>
-          <w:color w:val="666666"/>
           <w:sz w:val="18"/>
         </w:rPr>
         <w:t>Paramètres</w:t>
@@ -1541,19 +1595,22 @@
     </w:p>
     <w:p>
       <w:pPr>
-        <w:pStyle w:val="Heading2"/>
+        <w:spacing w:before="200" w:after="120"/>
       </w:pPr>
       <w:r>
         <w:rPr>
-          <w:rFonts w:ascii="Calibri" w:hAnsi="Calibri"/>
+          <w:rFonts w:ascii="Calibri Light" w:hAnsi="Calibri Light"/>
+          <w:b/>
           <w:color w:val="14213D"/>
+          <w:sz w:val="26"/>
         </w:rPr>
         <w:t>5.7 Mon profil</w:t>
       </w:r>
     </w:p>
     <w:p>
       <w:pPr>
-        <w:spacing w:after="120" w:line="240" w:lineRule="auto"/>
+        <w:pStyle w:val="ListNumber"/>
+        <w:spacing w:after="120" w:line="276" w:lineRule="auto"/>
       </w:pPr>
       <w:r>
         <w:rPr>
@@ -1561,19 +1618,543 @@
           <w:b w:val="0"/>
           <w:sz w:val="22"/>
         </w:rPr>
-        <w:t>Modifier nom et e-mail uniquement. Mot de passe → Paramètres → Sécurité.</w:t>
+        <w:t>Modifier nom et e-mail. Le mot de passe se change dans Paramètres → Sécurité.</w:t>
       </w:r>
     </w:p>
     <w:p>
       <w:pPr>
-        <w:pStyle w:val="Heading2"/>
+        <w:spacing w:before="280" w:after="120"/>
+      </w:pPr>
+      <w:r>
+        <w:rPr>
+          <w:rFonts w:ascii="Calibri Light" w:hAnsi="Calibri Light"/>
+          <w:b/>
+          <w:color w:val="14213D"/>
+          <w:sz w:val="32"/>
+        </w:rPr>
+        <w:t>6. FAQ</w:t>
+      </w:r>
+    </w:p>
+    <w:p>
+      <w:pPr>
+        <w:spacing w:before="200" w:after="120"/>
+      </w:pPr>
+      <w:r>
+        <w:rPr>
+          <w:rFonts w:ascii="Calibri Light" w:hAnsi="Calibri Light"/>
+          <w:b/>
+          <w:color w:val="14213D"/>
+          <w:sz w:val="26"/>
+        </w:rPr>
+        <w:t>6.1 Conformité facturation ?</w:t>
+      </w:r>
+    </w:p>
+    <w:p>
+      <w:pPr>
+        <w:spacing w:after="120" w:line="276" w:lineRule="auto"/>
       </w:pPr>
       <w:r>
         <w:rPr>
           <w:rFonts w:ascii="Calibri" w:hAnsi="Calibri"/>
+          <w:b w:val="0"/>
+          <w:sz w:val="22"/>
+        </w:rPr>
+        <w:t>Numérotation chronologique par utilisateur, mentions légales configurables, calcul HT/TVA/TTC.</w:t>
+      </w:r>
+    </w:p>
+    <w:p>
+      <w:pPr>
+        <w:spacing w:before="200" w:after="120"/>
+      </w:pPr>
+      <w:r>
+        <w:rPr>
+          <w:rFonts w:ascii="Calibri Light" w:hAnsi="Calibri Light"/>
+          <w:b/>
           <w:color w:val="14213D"/>
+          <w:sz w:val="26"/>
         </w:rPr>
-        <w:t>5.8 Abonnement</w:t>
+        <w:t>6.2 Import clients ?</w:t>
+      </w:r>
+    </w:p>
+    <w:p>
+      <w:pPr>
+        <w:spacing w:after="120" w:line="276" w:lineRule="auto"/>
+      </w:pPr>
+      <w:r>
+        <w:rPr>
+          <w:rFonts w:ascii="Calibri" w:hAnsi="Calibri"/>
+          <w:b w:val="0"/>
+          <w:sz w:val="22"/>
+        </w:rPr>
+        <w:t>Oui, via Import CSV sur la page Clients.</w:t>
+      </w:r>
+    </w:p>
+    <w:p>
+      <w:pPr>
+        <w:spacing w:before="200" w:after="120"/>
+      </w:pPr>
+      <w:r>
+        <w:rPr>
+          <w:rFonts w:ascii="Calibri Light" w:hAnsi="Calibri Light"/>
+          <w:b/>
+          <w:color w:val="14213D"/>
+          <w:sz w:val="26"/>
+        </w:rPr>
+        <w:t>6.3 Devises ?</w:t>
+      </w:r>
+    </w:p>
+    <w:p>
+      <w:pPr>
+        <w:spacing w:after="120" w:line="276" w:lineRule="auto"/>
+      </w:pPr>
+      <w:r>
+        <w:rPr>
+          <w:rFonts w:ascii="Calibri" w:hAnsi="Calibri"/>
+          <w:b w:val="0"/>
+          <w:sz w:val="22"/>
+        </w:rPr>
+        <w:t>XOF (défaut), EUR, USD, GBP.</w:t>
+      </w:r>
+    </w:p>
+    <w:p>
+      <w:pPr>
+        <w:spacing w:before="200" w:after="120"/>
+      </w:pPr>
+      <w:r>
+        <w:rPr>
+          <w:rFonts w:ascii="Calibri Light" w:hAnsi="Calibri Light"/>
+          <w:b/>
+          <w:color w:val="14213D"/>
+          <w:sz w:val="26"/>
+        </w:rPr>
+        <w:t>6.4 Relances automatiques ?</w:t>
+      </w:r>
+    </w:p>
+    <w:p>
+      <w:pPr>
+        <w:spacing w:after="120" w:line="276" w:lineRule="auto"/>
+      </w:pPr>
+      <w:r>
+        <w:rPr>
+          <w:rFonts w:ascii="Calibri" w:hAnsi="Calibri"/>
+          <w:b w:val="0"/>
+          <w:sz w:val="22"/>
+        </w:rPr>
+        <w:t>Oui si notifications e-mail activées dans Paramètres.</w:t>
+      </w:r>
+    </w:p>
+    <w:p>
+      <w:pPr>
+        <w:spacing w:before="200" w:after="120"/>
+      </w:pPr>
+      <w:r>
+        <w:rPr>
+          <w:rFonts w:ascii="Calibri Light" w:hAnsi="Calibri Light"/>
+          <w:b/>
+          <w:color w:val="14213D"/>
+          <w:sz w:val="26"/>
+        </w:rPr>
+        <w:t>6.5 Paiement client en ligne ?</w:t>
+      </w:r>
+    </w:p>
+    <w:p>
+      <w:pPr>
+        <w:spacing w:after="120" w:line="276" w:lineRule="auto"/>
+      </w:pPr>
+      <w:r>
+        <w:rPr>
+          <w:rFonts w:ascii="Calibri" w:hAnsi="Calibri"/>
+          <w:b w:val="0"/>
+          <w:sz w:val="22"/>
+        </w:rPr>
+        <w:t>Non — enregistrement manuel des paiements par l'utilisateur.</w:t>
+      </w:r>
+    </w:p>
+    <w:p>
+      <w:pPr>
+        <w:spacing w:before="200" w:after="120"/>
+      </w:pPr>
+      <w:r>
+        <w:rPr>
+          <w:rFonts w:ascii="Calibri Light" w:hAnsi="Calibri Light"/>
+          <w:b/>
+          <w:color w:val="14213D"/>
+          <w:sz w:val="26"/>
+        </w:rPr>
+        <w:t>6.6 Support ?</w:t>
+      </w:r>
+    </w:p>
+    <w:p>
+      <w:pPr>
+        <w:spacing w:after="120" w:line="276" w:lineRule="auto"/>
+      </w:pPr>
+      <w:r>
+        <w:rPr>
+          <w:rFonts w:ascii="Calibri" w:hAnsi="Calibri"/>
+          <w:b w:val="0"/>
+          <w:sz w:val="22"/>
+        </w:rPr>
+        <w:t>essev2030@gmail.com</w:t>
+      </w:r>
+    </w:p>
+    <w:p>
+      <w:pPr>
+        <w:spacing w:before="280" w:after="120"/>
+      </w:pPr>
+      <w:r>
+        <w:rPr>
+          <w:rFonts w:ascii="Calibri Light" w:hAnsi="Calibri Light"/>
+          <w:b/>
+          <w:color w:val="14213D"/>
+          <w:sz w:val="32"/>
+        </w:rPr>
+        <w:t>7. Dépannage</w:t>
+      </w:r>
+    </w:p>
+    <w:p>
+      <w:pPr>
+        <w:spacing w:before="200" w:after="120"/>
+      </w:pPr>
+      <w:r>
+        <w:rPr>
+          <w:rFonts w:ascii="Calibri Light" w:hAnsi="Calibri Light"/>
+          <w:b/>
+          <w:color w:val="14213D"/>
+          <w:sz w:val="26"/>
+        </w:rPr>
+        <w:t>7.1 Connexion impossible</w:t>
+      </w:r>
+    </w:p>
+    <w:p>
+      <w:pPr>
+        <w:pStyle w:val="ListNumber"/>
+        <w:spacing w:after="120" w:line="276" w:lineRule="auto"/>
+      </w:pPr>
+      <w:r>
+        <w:rPr>
+          <w:rFonts w:ascii="Calibri" w:hAnsi="Calibri"/>
+          <w:b w:val="0"/>
+          <w:sz w:val="22"/>
+        </w:rPr>
+        <w:t>Vérifier identifiants.</w:t>
+      </w:r>
+    </w:p>
+    <w:p>
+      <w:pPr>
+        <w:pStyle w:val="ListNumber"/>
+        <w:spacing w:after="120" w:line="276" w:lineRule="auto"/>
+      </w:pPr>
+      <w:r>
+        <w:rPr>
+          <w:rFonts w:ascii="Calibri" w:hAnsi="Calibri"/>
+          <w:b w:val="0"/>
+          <w:sz w:val="22"/>
+        </w:rPr>
+        <w:t>Utiliser « Mot de passe oublié ».</w:t>
+      </w:r>
+    </w:p>
+    <w:p>
+      <w:pPr>
+        <w:pStyle w:val="ListNumber"/>
+        <w:spacing w:after="120" w:line="276" w:lineRule="auto"/>
+      </w:pPr>
+      <w:r>
+        <w:rPr>
+          <w:rFonts w:ascii="Calibri" w:hAnsi="Calibri"/>
+          <w:b w:val="0"/>
+          <w:sz w:val="22"/>
+        </w:rPr>
+        <w:t>Tester un autre navigateur.</w:t>
+      </w:r>
+    </w:p>
+    <w:p>
+      <w:pPr>
+        <w:spacing w:before="200" w:after="120"/>
+      </w:pPr>
+      <w:r>
+        <w:rPr>
+          <w:rFonts w:ascii="Calibri Light" w:hAnsi="Calibri Light"/>
+          <w:b/>
+          <w:color w:val="14213D"/>
+          <w:sz w:val="26"/>
+        </w:rPr>
+        <w:t>7.2 E-mail de réinitialisation non reçu</w:t>
+      </w:r>
+    </w:p>
+    <w:p>
+      <w:pPr>
+        <w:pStyle w:val="ListNumber"/>
+        <w:spacing w:after="120" w:line="276" w:lineRule="auto"/>
+      </w:pPr>
+      <w:r>
+        <w:rPr>
+          <w:rFonts w:ascii="Calibri" w:hAnsi="Calibri"/>
+          <w:b w:val="0"/>
+          <w:sz w:val="22"/>
+        </w:rPr>
+        <w:t>Vérifier les spams.</w:t>
+      </w:r>
+    </w:p>
+    <w:p>
+      <w:pPr>
+        <w:pStyle w:val="ListNumber"/>
+        <w:spacing w:after="120" w:line="276" w:lineRule="auto"/>
+      </w:pPr>
+      <w:r>
+        <w:rPr>
+          <w:rFonts w:ascii="Calibri" w:hAnsi="Calibri"/>
+          <w:b w:val="0"/>
+          <w:sz w:val="22"/>
+        </w:rPr>
+        <w:t>Contrôler la configuration SMTP du backend (voir MAIL-SETUP.md).</w:t>
+      </w:r>
+    </w:p>
+    <w:p>
+      <w:pPr>
+        <w:pStyle w:val="ListNumber"/>
+        <w:spacing w:after="120" w:line="276" w:lineRule="auto"/>
+      </w:pPr>
+      <w:r>
+        <w:rPr>
+          <w:rFonts w:ascii="Calibri" w:hAnsi="Calibri"/>
+          <w:b w:val="0"/>
+          <w:sz w:val="22"/>
+        </w:rPr>
+        <w:t>En développement : MAIL_MAILER=log écrit dans storage/logs/laravel.log.</w:t>
+      </w:r>
+    </w:p>
+    <w:p>
+      <w:pPr>
+        <w:spacing w:before="200" w:after="120"/>
+      </w:pPr>
+      <w:r>
+        <w:rPr>
+          <w:rFonts w:ascii="Calibri Light" w:hAnsi="Calibri Light"/>
+          <w:b/>
+          <w:color w:val="14213D"/>
+          <w:sz w:val="26"/>
+        </w:rPr>
+        <w:t>7.3 PDF incomplet</w:t>
+      </w:r>
+    </w:p>
+    <w:p>
+      <w:pPr>
+        <w:pStyle w:val="ListNumber"/>
+        <w:spacing w:after="120" w:line="276" w:lineRule="auto"/>
+      </w:pPr>
+      <w:r>
+        <w:rPr>
+          <w:rFonts w:ascii="Calibri" w:hAnsi="Calibri"/>
+          <w:b w:val="0"/>
+          <w:sz w:val="22"/>
+        </w:rPr>
+        <w:t>Remplir Paramètres → Entreprise (coordonnées, logo, mentions légales).</w:t>
+      </w:r>
+    </w:p>
+    <w:p>
+      <w:pPr>
+        <w:pStyle w:val="ListNumber"/>
+        <w:spacing w:after="120" w:line="276" w:lineRule="auto"/>
+      </w:pPr>
+      <w:r>
+        <w:rPr>
+          <w:rFonts w:ascii="Calibri" w:hAnsi="Calibri"/>
+          <w:b w:val="0"/>
+          <w:sz w:val="22"/>
+        </w:rPr>
+        <w:t>Désactiver le bloqueur de pop-ups pour le téléchargement.</w:t>
+      </w:r>
+    </w:p>
+    <w:p>
+      <w:pPr>
+        <w:spacing w:before="200" w:after="120"/>
+      </w:pPr>
+      <w:r>
+        <w:rPr>
+          <w:rFonts w:ascii="Calibri Light" w:hAnsi="Calibri Light"/>
+          <w:b/>
+          <w:color w:val="14213D"/>
+          <w:sz w:val="26"/>
+        </w:rPr>
+        <w:t>7.4 Montants masqués</w:t>
+      </w:r>
+    </w:p>
+    <w:p>
+      <w:pPr>
+        <w:pStyle w:val="ListNumber"/>
+        <w:spacing w:after="120" w:line="276" w:lineRule="auto"/>
+      </w:pPr>
+      <w:r>
+        <w:rPr>
+          <w:rFonts w:ascii="Calibri" w:hAnsi="Calibri"/>
+          <w:b w:val="0"/>
+          <w:sz w:val="22"/>
+        </w:rPr>
+        <w:t>Cliquez le cadenas et saisissez votre mot de passe pour déverrouiller l'affichage.</w:t>
+      </w:r>
+    </w:p>
+    <w:p>
+      <w:pPr>
+        <w:spacing w:before="280" w:after="120"/>
+      </w:pPr>
+      <w:r>
+        <w:rPr>
+          <w:rFonts w:ascii="Calibri Light" w:hAnsi="Calibri Light"/>
+          <w:b/>
+          <w:color w:val="14213D"/>
+          <w:sz w:val="32"/>
+        </w:rPr>
+        <w:t>8. Contact</w:t>
+      </w:r>
+    </w:p>
+    <w:tbl>
+      <w:tblPr>
+        <w:tblStyle w:val="TableGrid"/>
+        <w:tblW w:type="auto" w:w="0"/>
+        <w:tblLook w:firstColumn="1" w:firstRow="1" w:lastColumn="0" w:lastRow="0" w:noHBand="0" w:noVBand="1" w:val="04A0"/>
+      </w:tblPr>
+      <w:tblGrid>
+        <w:gridCol w:w="4703"/>
+        <w:gridCol w:w="4703"/>
+      </w:tblGrid>
+      <w:tr>
+        <w:tc>
+          <w:tcPr>
+            <w:tcW w:type="dxa" w:w="4703"/>
+            <w:shd w:fill="F2F2F2"/>
+          </w:tcPr>
+          <w:p>
+            <w:r>
+              <w:rPr>
+                <w:rFonts w:ascii="Calibri" w:hAnsi="Calibri"/>
+                <w:b/>
+                <w:sz w:val="20"/>
+              </w:rPr>
+              <w:t>Type</w:t>
+            </w:r>
+          </w:p>
+        </w:tc>
+        <w:tc>
+          <w:tcPr>
+            <w:tcW w:type="dxa" w:w="4703"/>
+            <w:shd w:fill="F2F2F2"/>
+          </w:tcPr>
+          <w:p>
+            <w:r>
+              <w:rPr>
+                <w:rFonts w:ascii="Calibri" w:hAnsi="Calibri"/>
+                <w:b/>
+                <w:sz w:val="20"/>
+              </w:rPr>
+              <w:t>Contact</w:t>
+            </w:r>
+          </w:p>
+        </w:tc>
+      </w:tr>
+      <w:tr>
+        <w:tc>
+          <w:tcPr>
+            <w:tcW w:type="dxa" w:w="4703"/>
+          </w:tcPr>
+          <w:p>
+            <w:r>
+              <w:rPr>
+                <w:rFonts w:ascii="Calibri" w:hAnsi="Calibri"/>
+                <w:sz w:val="20"/>
+              </w:rPr>
+              <w:t>Support</w:t>
+            </w:r>
+          </w:p>
+        </w:tc>
+        <w:tc>
+          <w:tcPr>
+            <w:tcW w:type="dxa" w:w="4703"/>
+          </w:tcPr>
+          <w:p>
+            <w:r>
+              <w:rPr>
+                <w:rFonts w:ascii="Calibri" w:hAnsi="Calibri"/>
+                <w:sz w:val="20"/>
+              </w:rPr>
+              <w:t>essev2030@gmail.com</w:t>
+            </w:r>
+          </w:p>
+        </w:tc>
+      </w:tr>
+      <w:tr>
+        <w:tc>
+          <w:tcPr>
+            <w:tcW w:type="dxa" w:w="4703"/>
+          </w:tcPr>
+          <w:p>
+            <w:r>
+              <w:rPr>
+                <w:rFonts w:ascii="Calibri" w:hAnsi="Calibri"/>
+                <w:sz w:val="20"/>
+              </w:rPr>
+              <w:t>Documentation technique</w:t>
+            </w:r>
+          </w:p>
+        </w:tc>
+        <w:tc>
+          <w:tcPr>
+            <w:tcW w:type="dxa" w:w="4703"/>
+          </w:tcPr>
+          <w:p>
+            <w:r>
+              <w:rPr>
+                <w:rFonts w:ascii="Calibri" w:hAnsi="Calibri"/>
+                <w:sz w:val="20"/>
+              </w:rPr>
+              <w:t>docs/ — README.md, TESTING.md, MAIL-SETUP.md</w:t>
+            </w:r>
+          </w:p>
+        </w:tc>
+      </w:tr>
+      <w:tr>
+        <w:tc>
+          <w:tcPr>
+            <w:tcW w:type="dxa" w:w="4703"/>
+          </w:tcPr>
+          <w:p>
+            <w:r>
+              <w:rPr>
+                <w:rFonts w:ascii="Calibri" w:hAnsi="Calibri"/>
+                <w:sz w:val="20"/>
+              </w:rPr>
+              <w:t>Dépôt source</w:t>
+            </w:r>
+          </w:p>
+        </w:tc>
+        <w:tc>
+          <w:tcPr>
+            <w:tcW w:type="dxa" w:w="4703"/>
+          </w:tcPr>
+          <w:p>
+            <w:r>
+              <w:rPr>
+                <w:rFonts w:ascii="Calibri" w:hAnsi="Calibri"/>
+                <w:sz w:val="20"/>
+              </w:rPr>
+              <w:t>github.com/jojoskino/saas-facturation</w:t>
+            </w:r>
+          </w:p>
+        </w:tc>
+      </w:tr>
+    </w:tbl>
+    <w:p/>
+    <w:p>
+      <w:pPr>
+        <w:spacing w:before="200" w:after="120"/>
+      </w:pPr>
+      <w:r>
+        <w:rPr>
+          <w:rFonts w:ascii="Calibri Light" w:hAnsi="Calibri Light"/>
+          <w:b/>
+          <w:color w:val="14213D"/>
+          <w:sz w:val="26"/>
+        </w:rPr>
+        <w:t>Historique des versions</w:t>
       </w:r>
     </w:p>
     <w:tbl>
@@ -1591,840 +2172,15 @@
         <w:tc>
           <w:tcPr>
             <w:tcW w:type="dxa" w:w="3135"/>
+            <w:shd w:fill="F2F2F2"/>
           </w:tcPr>
           <w:p>
             <w:r>
-              <w:t>Offre</w:t>
-            </w:r>
-          </w:p>
-        </w:tc>
-        <w:tc>
-          <w:tcPr>
-            <w:tcW w:type="dxa" w:w="3135"/>
-          </w:tcPr>
-          <w:p>
-            <w:r>
-              <w:t>Tarif</w:t>
-            </w:r>
-          </w:p>
-        </w:tc>
-        <w:tc>
-          <w:tcPr>
-            <w:tcW w:type="dxa" w:w="3135"/>
-          </w:tcPr>
-          <w:p>
-            <w:r>
-              <w:t>Caractéristiques</w:t>
-            </w:r>
-          </w:p>
-        </w:tc>
-      </w:tr>
-      <w:tr>
-        <w:tc>
-          <w:tcPr>
-            <w:tcW w:type="dxa" w:w="3135"/>
-          </w:tcPr>
-          <w:p>
-            <w:r>
-              <w:t>Gratuit</w:t>
-            </w:r>
-          </w:p>
-        </w:tc>
-        <w:tc>
-          <w:tcPr>
-            <w:tcW w:type="dxa" w:w="3135"/>
-          </w:tcPr>
-          <w:p>
-            <w:r>
-              <w:t>0 F CFA/mois</w:t>
-            </w:r>
-          </w:p>
-        </w:tc>
-        <w:tc>
-          <w:tcPr>
-            <w:tcW w:type="dxa" w:w="3135"/>
-          </w:tcPr>
-          <w:p>
-            <w:r>
-              <w:t>10 factures/mois, PDF, dashboard</w:t>
-            </w:r>
-          </w:p>
-        </w:tc>
-      </w:tr>
-      <w:tr>
-        <w:tc>
-          <w:tcPr>
-            <w:tcW w:type="dxa" w:w="3135"/>
-          </w:tcPr>
-          <w:p>
-            <w:r>
-              <w:t>Pro</w:t>
-            </w:r>
-          </w:p>
-        </w:tc>
-        <w:tc>
-          <w:tcPr>
-            <w:tcW w:type="dxa" w:w="3135"/>
-          </w:tcPr>
-          <w:p>
-            <w:r>
-              <w:t>5 000 F CFA/mois</w:t>
-            </w:r>
-          </w:p>
-        </w:tc>
-        <w:tc>
-          <w:tcPr>
-            <w:tcW w:type="dxa" w:w="3135"/>
-          </w:tcPr>
-          <w:p>
-            <w:r>
-              <w:t>Illimité, CSV, rapports avancés, import clients, Stripe</w:t>
-            </w:r>
-          </w:p>
-        </w:tc>
-      </w:tr>
-      <w:tr>
-        <w:tc>
-          <w:tcPr>
-            <w:tcW w:type="dxa" w:w="3135"/>
-          </w:tcPr>
-          <w:p>
-            <w:r>
-              <w:t>Entreprise</w:t>
-            </w:r>
-          </w:p>
-        </w:tc>
-        <w:tc>
-          <w:tcPr>
-            <w:tcW w:type="dxa" w:w="3135"/>
-          </w:tcPr>
-          <w:p>
-            <w:r>
-              <w:t>Sur devis</w:t>
-            </w:r>
-          </w:p>
-        </w:tc>
-        <w:tc>
-          <w:tcPr>
-            <w:tcW w:type="dxa" w:w="3135"/>
-          </w:tcPr>
-          <w:p>
-            <w:r>
-              <w:t>Roadmap : multi-users, SLA — contact commercial</w:t>
-            </w:r>
-          </w:p>
-        </w:tc>
-      </w:tr>
-    </w:tbl>
-    <w:p>
-      <w:pPr>
-        <w:pStyle w:val="ListNumber"/>
-        <w:spacing w:after="80" w:line="240" w:lineRule="auto"/>
-      </w:pPr>
-      <w:r>
-        <w:rPr>
-          <w:rFonts w:ascii="Calibri" w:hAnsi="Calibri"/>
-          <w:b w:val="0"/>
-          <w:sz w:val="22"/>
-        </w:rPr>
-        <w:t>1. Avatar → Abonnement → Passer à Pro (Stripe Checkout).</w:t>
-      </w:r>
-    </w:p>
-    <w:p>
-      <w:pPr>
-        <w:pStyle w:val="ListNumber"/>
-        <w:spacing w:after="80" w:line="240" w:lineRule="auto"/>
-      </w:pPr>
-      <w:r>
-        <w:rPr>
-          <w:rFonts w:ascii="Calibri" w:hAnsi="Calibri"/>
-          <w:b w:val="0"/>
-          <w:sz w:val="22"/>
-        </w:rPr>
-        <w:t>2. Gérer : portail Stripe (carte, résiliation).</w:t>
-      </w:r>
-    </w:p>
-    <w:p>
-      <w:pPr>
-        <w:jc w:val="center"/>
-        <w:pBdr>
-          <w:top w:val="single" w:sz="4" w:space="4" w:color="FCA311"/>
-          <w:left w:val="single" w:sz="4" w:space="4" w:color="FCA311"/>
-          <w:bottom w:val="single" w:sz="4" w:space="4" w:color="FCA311"/>
-          <w:right w:val="single" w:sz="4" w:space="4" w:color="FCA311"/>
-        </w:pBdr>
-      </w:pPr>
-      <w:r>
-        <w:rPr>
-          <w:rFonts w:ascii="Calibri" w:hAnsi="Calibri"/>
-          <w:b/>
-          <w:i/>
-          <w:color w:val="FCA311"/>
-          <w:sz w:val="20"/>
-        </w:rPr>
-        <w:t>[CAPTURE D'ÉCRAN — Page Abonnement]</w:t>
-      </w:r>
-    </w:p>
-    <w:p>
-      <w:pPr>
-        <w:spacing w:after="200" w:line="240" w:lineRule="auto"/>
-        <w:jc w:val="center"/>
-      </w:pPr>
-      <w:r>
-        <w:rPr>
-          <w:rFonts w:ascii="Calibri" w:hAnsi="Calibri"/>
-          <w:b w:val="0"/>
-          <w:color w:val="666666"/>
-          <w:sz w:val="18"/>
-        </w:rPr>
-        <w:t>Page Abonnement</w:t>
-      </w:r>
-    </w:p>
-    <w:p>
-      <w:r>
-        <w:br w:type="page"/>
-      </w:r>
-    </w:p>
-    <w:p>
-      <w:pPr>
-        <w:pStyle w:val="Heading1"/>
-      </w:pPr>
-      <w:r>
-        <w:rPr>
-          <w:rFonts w:ascii="Calibri" w:hAnsi="Calibri"/>
-          <w:color w:val="14213D"/>
-        </w:rPr>
-        <w:t>6. FAQ</w:t>
-      </w:r>
-    </w:p>
-    <w:p>
-      <w:pPr>
-        <w:pStyle w:val="Heading2"/>
-      </w:pPr>
-      <w:r>
-        <w:rPr>
-          <w:rFonts w:ascii="Calibri" w:hAnsi="Calibri"/>
-          <w:color w:val="14213D"/>
-        </w:rPr>
-        <w:t>6.1 Conformité facturation ?</w:t>
-      </w:r>
-    </w:p>
-    <w:p>
-      <w:pPr>
-        <w:spacing w:after="120" w:line="240" w:lineRule="auto"/>
-      </w:pPr>
-      <w:r>
-        <w:rPr>
-          <w:rFonts w:ascii="Calibri" w:hAnsi="Calibri"/>
-          <w:b w:val="0"/>
-          <w:sz w:val="22"/>
-        </w:rPr>
-        <w:t>Numérotation chronologique, mentions légales, calcul HT/TVA/TTC.</w:t>
-      </w:r>
-    </w:p>
-    <w:p>
-      <w:pPr>
-        <w:pStyle w:val="Heading2"/>
-      </w:pPr>
-      <w:r>
-        <w:rPr>
-          <w:rFonts w:ascii="Calibri" w:hAnsi="Calibri"/>
-          <w:color w:val="14213D"/>
-        </w:rPr>
-        <w:t>6.2 Import clients ?</w:t>
-      </w:r>
-    </w:p>
-    <w:p>
-      <w:pPr>
-        <w:spacing w:after="120" w:line="240" w:lineRule="auto"/>
-      </w:pPr>
-      <w:r>
-        <w:rPr>
-          <w:rFonts w:ascii="Calibri" w:hAnsi="Calibri"/>
-          <w:b w:val="0"/>
-          <w:sz w:val="22"/>
-        </w:rPr>
-        <w:t>CSV réservé Pro.</w:t>
-      </w:r>
-    </w:p>
-    <w:p>
-      <w:pPr>
-        <w:pStyle w:val="Heading2"/>
-      </w:pPr>
-      <w:r>
-        <w:rPr>
-          <w:rFonts w:ascii="Calibri" w:hAnsi="Calibri"/>
-          <w:color w:val="14213D"/>
-        </w:rPr>
-        <w:t>6.3 Devises ?</w:t>
-      </w:r>
-    </w:p>
-    <w:p>
-      <w:pPr>
-        <w:spacing w:after="120" w:line="240" w:lineRule="auto"/>
-      </w:pPr>
-      <w:r>
-        <w:rPr>
-          <w:rFonts w:ascii="Calibri" w:hAnsi="Calibri"/>
-          <w:b w:val="0"/>
-          <w:sz w:val="22"/>
-        </w:rPr>
-        <w:t>XOF (défaut), EUR, USD, GBP.</w:t>
-      </w:r>
-    </w:p>
-    <w:p>
-      <w:pPr>
-        <w:pStyle w:val="Heading2"/>
-      </w:pPr>
-      <w:r>
-        <w:rPr>
-          <w:rFonts w:ascii="Calibri" w:hAnsi="Calibri"/>
-          <w:color w:val="14213D"/>
-        </w:rPr>
-        <w:t>6.4 Relances auto ?</w:t>
-      </w:r>
-    </w:p>
-    <w:p>
-      <w:pPr>
-        <w:spacing w:after="120" w:line="240" w:lineRule="auto"/>
-      </w:pPr>
-      <w:r>
-        <w:rPr>
-          <w:rFonts w:ascii="Calibri" w:hAnsi="Calibri"/>
-          <w:b w:val="0"/>
-          <w:sz w:val="22"/>
-        </w:rPr>
-        <w:t>Oui si notifications e-mail activées (tous plans).</w:t>
-      </w:r>
-    </w:p>
-    <w:p>
-      <w:pPr>
-        <w:pStyle w:val="Heading2"/>
-      </w:pPr>
-      <w:r>
-        <w:rPr>
-          <w:rFonts w:ascii="Calibri" w:hAnsi="Calibri"/>
-          <w:color w:val="14213D"/>
-        </w:rPr>
-        <w:t>6.5 Paiement client en ligne ?</w:t>
-      </w:r>
-    </w:p>
-    <w:p>
-      <w:pPr>
-        <w:spacing w:after="120" w:line="240" w:lineRule="auto"/>
-      </w:pPr>
-      <w:r>
-        <w:rPr>
-          <w:rFonts w:ascii="Calibri" w:hAnsi="Calibri"/>
-          <w:b w:val="0"/>
-          <w:sz w:val="22"/>
-        </w:rPr>
-        <w:t>Non — enregistrement manuel des paiements.</w:t>
-      </w:r>
-    </w:p>
-    <w:p>
-      <w:pPr>
-        <w:pStyle w:val="Heading2"/>
-      </w:pPr>
-      <w:r>
-        <w:rPr>
-          <w:rFonts w:ascii="Calibri" w:hAnsi="Calibri"/>
-          <w:color w:val="14213D"/>
-        </w:rPr>
-        <w:t>6.6 Support ?</w:t>
-      </w:r>
-    </w:p>
-    <w:p>
-      <w:pPr>
-        <w:spacing w:after="120" w:line="240" w:lineRule="auto"/>
-      </w:pPr>
-      <w:r>
-        <w:rPr>
-          <w:rFonts w:ascii="Calibri" w:hAnsi="Calibri"/>
-          <w:b w:val="0"/>
-          <w:sz w:val="22"/>
-        </w:rPr>
-        <w:t>contact@lafacture.app (prioritaire Pro).</w:t>
-      </w:r>
-    </w:p>
-    <w:p>
-      <w:r>
-        <w:br w:type="page"/>
-      </w:r>
-    </w:p>
-    <w:p>
-      <w:pPr>
-        <w:pStyle w:val="Heading1"/>
-      </w:pPr>
-      <w:r>
-        <w:rPr>
-          <w:rFonts w:ascii="Calibri" w:hAnsi="Calibri"/>
-          <w:color w:val="14213D"/>
-        </w:rPr>
-        <w:t>7. Dépannage</w:t>
-      </w:r>
-    </w:p>
-    <w:p>
-      <w:pPr>
-        <w:pStyle w:val="Heading2"/>
-      </w:pPr>
-      <w:r>
-        <w:rPr>
-          <w:rFonts w:ascii="Calibri" w:hAnsi="Calibri"/>
-          <w:color w:val="14213D"/>
-        </w:rPr>
-        <w:t>7.1 Connexion impossible</w:t>
-      </w:r>
-    </w:p>
-    <w:p>
-      <w:pPr>
-        <w:pStyle w:val="ListNumber"/>
-        <w:spacing w:after="80" w:line="240" w:lineRule="auto"/>
-      </w:pPr>
-      <w:r>
-        <w:rPr>
-          <w:rFonts w:ascii="Calibri" w:hAnsi="Calibri"/>
-          <w:b w:val="0"/>
-          <w:sz w:val="22"/>
-        </w:rPr>
-        <w:t>1. Vérifier identifiants</w:t>
-      </w:r>
-    </w:p>
-    <w:p>
-      <w:pPr>
-        <w:pStyle w:val="ListNumber"/>
-        <w:spacing w:after="80" w:line="240" w:lineRule="auto"/>
-      </w:pPr>
-      <w:r>
-        <w:rPr>
-          <w:rFonts w:ascii="Calibri" w:hAnsi="Calibri"/>
-          <w:b w:val="0"/>
-          <w:sz w:val="22"/>
-        </w:rPr>
-        <w:t>2. Mot de passe oublié</w:t>
-      </w:r>
-    </w:p>
-    <w:p>
-      <w:pPr>
-        <w:pStyle w:val="ListNumber"/>
-        <w:spacing w:after="80" w:line="240" w:lineRule="auto"/>
-      </w:pPr>
-      <w:r>
-        <w:rPr>
-          <w:rFonts w:ascii="Calibri" w:hAnsi="Calibri"/>
-          <w:b w:val="0"/>
-          <w:sz w:val="22"/>
-        </w:rPr>
-        <w:t>3. Autre navigateur</w:t>
-      </w:r>
-    </w:p>
-    <w:p>
-      <w:pPr>
-        <w:pStyle w:val="Heading2"/>
-      </w:pPr>
-      <w:r>
-        <w:rPr>
-          <w:rFonts w:ascii="Calibri" w:hAnsi="Calibri"/>
-          <w:color w:val="14213D"/>
-        </w:rPr>
-        <w:t>7.2 Quota factures</w:t>
-      </w:r>
-    </w:p>
-    <w:p>
-      <w:pPr>
-        <w:pStyle w:val="ListNumber"/>
-        <w:spacing w:after="80" w:line="240" w:lineRule="auto"/>
-      </w:pPr>
-      <w:r>
-        <w:rPr>
-          <w:rFonts w:ascii="Calibri" w:hAnsi="Calibri"/>
-          <w:b w:val="0"/>
-          <w:sz w:val="22"/>
-        </w:rPr>
-        <w:t>1. Limite 10/mois Gratuit</w:t>
-      </w:r>
-    </w:p>
-    <w:p>
-      <w:pPr>
-        <w:pStyle w:val="ListNumber"/>
-        <w:spacing w:after="80" w:line="240" w:lineRule="auto"/>
-      </w:pPr>
-      <w:r>
-        <w:rPr>
-          <w:rFonts w:ascii="Calibri" w:hAnsi="Calibri"/>
-          <w:b w:val="0"/>
-          <w:sz w:val="22"/>
-        </w:rPr>
-        <w:t>2. Passer Pro</w:t>
-      </w:r>
-    </w:p>
-    <w:p>
-      <w:pPr>
-        <w:pStyle w:val="Heading2"/>
-      </w:pPr>
-      <w:r>
-        <w:rPr>
-          <w:rFonts w:ascii="Calibri" w:hAnsi="Calibri"/>
-          <w:color w:val="14213D"/>
-        </w:rPr>
-        <w:t>7.3 Export verrouillé</w:t>
-      </w:r>
-    </w:p>
-    <w:p>
-      <w:pPr>
-        <w:pStyle w:val="ListNumber"/>
-        <w:spacing w:after="80" w:line="240" w:lineRule="auto"/>
-      </w:pPr>
-      <w:r>
-        <w:rPr>
-          <w:rFonts w:ascii="Calibri" w:hAnsi="Calibri"/>
-          <w:b w:val="0"/>
-          <w:sz w:val="22"/>
-        </w:rPr>
-        <w:t>1. Fonction Pro</w:t>
-      </w:r>
-    </w:p>
-    <w:p>
-      <w:pPr>
-        <w:pStyle w:val="ListNumber"/>
-        <w:spacing w:after="80" w:line="240" w:lineRule="auto"/>
-      </w:pPr>
-      <w:r>
-        <w:rPr>
-          <w:rFonts w:ascii="Calibri" w:hAnsi="Calibri"/>
-          <w:b w:val="0"/>
-          <w:sz w:val="22"/>
-        </w:rPr>
-        <w:t>2. Vérifier plan Abonnement</w:t>
-      </w:r>
-    </w:p>
-    <w:p>
-      <w:pPr>
-        <w:pStyle w:val="Heading2"/>
-      </w:pPr>
-      <w:r>
-        <w:rPr>
-          <w:rFonts w:ascii="Calibri" w:hAnsi="Calibri"/>
-          <w:color w:val="14213D"/>
-        </w:rPr>
-        <w:t>7.4 Échec Stripe</w:t>
-      </w:r>
-    </w:p>
-    <w:p>
-      <w:pPr>
-        <w:pStyle w:val="ListNumber"/>
-        <w:spacing w:after="80" w:line="240" w:lineRule="auto"/>
-      </w:pPr>
-      <w:r>
-        <w:rPr>
-          <w:rFonts w:ascii="Calibri" w:hAnsi="Calibri"/>
-          <w:b w:val="0"/>
-          <w:sz w:val="22"/>
-        </w:rPr>
-        <w:t>1. Carte valide</w:t>
-      </w:r>
-    </w:p>
-    <w:p>
-      <w:pPr>
-        <w:pStyle w:val="ListNumber"/>
-        <w:spacing w:after="80" w:line="240" w:lineRule="auto"/>
-      </w:pPr>
-      <w:r>
-        <w:rPr>
-          <w:rFonts w:ascii="Calibri" w:hAnsi="Calibri"/>
-          <w:b w:val="0"/>
-          <w:sz w:val="22"/>
-        </w:rPr>
-        <w:t>2. Contacter contact@lafacture.app</w:t>
-      </w:r>
-    </w:p>
-    <w:p>
-      <w:pPr>
-        <w:pStyle w:val="Heading2"/>
-      </w:pPr>
-      <w:r>
-        <w:rPr>
-          <w:rFonts w:ascii="Calibri" w:hAnsi="Calibri"/>
-          <w:color w:val="14213D"/>
-        </w:rPr>
-        <w:t>7.5 PDF incomplet</w:t>
-      </w:r>
-    </w:p>
-    <w:p>
-      <w:pPr>
-        <w:pStyle w:val="ListNumber"/>
-        <w:spacing w:after="80" w:line="240" w:lineRule="auto"/>
-      </w:pPr>
-      <w:r>
-        <w:rPr>
-          <w:rFonts w:ascii="Calibri" w:hAnsi="Calibri"/>
-          <w:b w:val="0"/>
-          <w:sz w:val="22"/>
-        </w:rPr>
-        <w:t>1. Remplir Paramètres entreprise</w:t>
-      </w:r>
-    </w:p>
-    <w:p>
-      <w:pPr>
-        <w:pStyle w:val="ListNumber"/>
-        <w:spacing w:after="80" w:line="240" w:lineRule="auto"/>
-      </w:pPr>
-      <w:r>
-        <w:rPr>
-          <w:rFonts w:ascii="Calibri" w:hAnsi="Calibri"/>
-          <w:b w:val="0"/>
-          <w:sz w:val="22"/>
-        </w:rPr>
-        <w:t>2. Désactiver bloqueur pop-up</w:t>
-      </w:r>
-    </w:p>
-    <w:p>
-      <w:r>
-        <w:br w:type="page"/>
-      </w:r>
-    </w:p>
-    <w:p>
-      <w:pPr>
-        <w:pStyle w:val="Heading1"/>
-      </w:pPr>
-      <w:r>
-        <w:rPr>
-          <w:rFonts w:ascii="Calibri" w:hAnsi="Calibri"/>
-          <w:color w:val="14213D"/>
-        </w:rPr>
-        <w:t>8. Contact et documents légaux</w:t>
-      </w:r>
-    </w:p>
-    <w:tbl>
-      <w:tblPr>
-        <w:tblStyle w:val="TableGrid"/>
-        <w:tblW w:type="auto" w:w="0"/>
-        <w:tblLook w:firstColumn="1" w:firstRow="1" w:lastColumn="0" w:lastRow="0" w:noHBand="0" w:noVBand="1" w:val="04A0"/>
-      </w:tblPr>
-      <w:tblGrid>
-        <w:gridCol w:w="4703"/>
-        <w:gridCol w:w="4703"/>
-      </w:tblGrid>
-      <w:tr>
-        <w:tc>
-          <w:tcPr>
-            <w:tcW w:type="dxa" w:w="4703"/>
-          </w:tcPr>
-          <w:p>
-            <w:r>
-              <w:t>Type</w:t>
-            </w:r>
-          </w:p>
-        </w:tc>
-        <w:tc>
-          <w:tcPr>
-            <w:tcW w:type="dxa" w:w="4703"/>
-          </w:tcPr>
-          <w:p>
-            <w:r>
-              <w:t>Contact / URL</w:t>
-            </w:r>
-          </w:p>
-        </w:tc>
-      </w:tr>
-      <w:tr>
-        <w:tc>
-          <w:tcPr>
-            <w:tcW w:type="dxa" w:w="4703"/>
-          </w:tcPr>
-          <w:p>
-            <w:r>
-              <w:t>Support</w:t>
-            </w:r>
-          </w:p>
-        </w:tc>
-        <w:tc>
-          <w:tcPr>
-            <w:tcW w:type="dxa" w:w="4703"/>
-          </w:tcPr>
-          <w:p>
-            <w:r>
-              <w:t>contact@lafacture.app</w:t>
-            </w:r>
-          </w:p>
-        </w:tc>
-      </w:tr>
-      <w:tr>
-        <w:tc>
-          <w:tcPr>
-            <w:tcW w:type="dxa" w:w="4703"/>
-          </w:tcPr>
-          <w:p>
-            <w:r>
-              <w:t>Confidentialité</w:t>
-            </w:r>
-          </w:p>
-        </w:tc>
-        <w:tc>
-          <w:tcPr>
-            <w:tcW w:type="dxa" w:w="4703"/>
-          </w:tcPr>
-          <w:p>
-            <w:r>
-              <w:t>privacy@lafacture.app</w:t>
-            </w:r>
-          </w:p>
-        </w:tc>
-      </w:tr>
-      <w:tr>
-        <w:tc>
-          <w:tcPr>
-            <w:tcW w:type="dxa" w:w="4703"/>
-          </w:tcPr>
-          <w:p>
-            <w:r>
-              <w:t>Site</w:t>
-            </w:r>
-          </w:p>
-        </w:tc>
-        <w:tc>
-          <w:tcPr>
-            <w:tcW w:type="dxa" w:w="4703"/>
-          </w:tcPr>
-          <w:p>
-            <w:r>
-              <w:t>https://saas-facturation.vercel.app</w:t>
-            </w:r>
-          </w:p>
-        </w:tc>
-      </w:tr>
-      <w:tr>
-        <w:tc>
-          <w:tcPr>
-            <w:tcW w:type="dxa" w:w="4703"/>
-          </w:tcPr>
-          <w:p>
-            <w:r>
-              <w:t>Mentions légales</w:t>
-            </w:r>
-          </w:p>
-        </w:tc>
-        <w:tc>
-          <w:tcPr>
-            <w:tcW w:type="dxa" w:w="4703"/>
-          </w:tcPr>
-          <w:p>
-            <w:r>
-              <w:t>/legal/mentions</w:t>
-            </w:r>
-          </w:p>
-        </w:tc>
-      </w:tr>
-      <w:tr>
-        <w:tc>
-          <w:tcPr>
-            <w:tcW w:type="dxa" w:w="4703"/>
-          </w:tcPr>
-          <w:p>
-            <w:r>
-              <w:t>Confidentialité</w:t>
-            </w:r>
-          </w:p>
-        </w:tc>
-        <w:tc>
-          <w:tcPr>
-            <w:tcW w:type="dxa" w:w="4703"/>
-          </w:tcPr>
-          <w:p>
-            <w:r>
-              <w:t>/legal/confidentialite</w:t>
-            </w:r>
-          </w:p>
-        </w:tc>
-      </w:tr>
-      <w:tr>
-        <w:tc>
-          <w:tcPr>
-            <w:tcW w:type="dxa" w:w="4703"/>
-          </w:tcPr>
-          <w:p>
-            <w:r>
-              <w:t>CGU</w:t>
-            </w:r>
-          </w:p>
-        </w:tc>
-        <w:tc>
-          <w:tcPr>
-            <w:tcW w:type="dxa" w:w="4703"/>
-          </w:tcPr>
-          <w:p>
-            <w:r>
-              <w:t>/legal/cgu</w:t>
-            </w:r>
-          </w:p>
-        </w:tc>
-      </w:tr>
-      <w:tr>
-        <w:tc>
-          <w:tcPr>
-            <w:tcW w:type="dxa" w:w="4703"/>
-          </w:tcPr>
-          <w:p>
-            <w:r>
-              <w:t>Cookies</w:t>
-            </w:r>
-          </w:p>
-        </w:tc>
-        <w:tc>
-          <w:tcPr>
-            <w:tcW w:type="dxa" w:w="4703"/>
-          </w:tcPr>
-          <w:p>
-            <w:r>
-              <w:t>/legal/cookies</w:t>
-            </w:r>
-          </w:p>
-        </w:tc>
-      </w:tr>
-    </w:tbl>
-    <w:p>
-      <w:pPr>
-        <w:pStyle w:val="Heading2"/>
-      </w:pPr>
-      <w:r>
-        <w:rPr>
-          <w:rFonts w:ascii="Calibri" w:hAnsi="Calibri"/>
-          <w:color w:val="14213D"/>
-        </w:rPr>
-        <w:t>8.1 Annexe technique (référence)</w:t>
-      </w:r>
-    </w:p>
-    <w:p>
-      <w:pPr>
-        <w:spacing w:after="120" w:line="240" w:lineRule="auto"/>
-      </w:pPr>
-      <w:r>
-        <w:rPr>
-          <w:rFonts w:ascii="Calibri" w:hAnsi="Calibri"/>
-          <w:b w:val="0"/>
-          <w:sz w:val="22"/>
-        </w:rPr>
-        <w:t>Stack : React 19 + Vite (frontend Vercel), Laravel 13 + Sanctum (API Fly.io), PostgreSQL, PDF DomPDF, abonnement Stripe.</w:t>
-      </w:r>
-    </w:p>
-    <w:tbl>
-      <w:tblPr>
-        <w:tblStyle w:val="TableGrid"/>
-        <w:tblW w:type="auto" w:w="0"/>
-        <w:tblLook w:firstColumn="1" w:firstRow="1" w:lastColumn="0" w:lastRow="0" w:noHBand="0" w:noVBand="1" w:val="04A0"/>
-      </w:tblPr>
-      <w:tblGrid>
-        <w:gridCol w:w="3135"/>
-        <w:gridCol w:w="3135"/>
-        <w:gridCol w:w="3135"/>
-      </w:tblGrid>
-      <w:tr>
-        <w:tc>
-          <w:tcPr>
-            <w:tcW w:type="dxa" w:w="3135"/>
-          </w:tcPr>
-          <w:p>
-            <w:r>
+              <w:rPr>
+                <w:rFonts w:ascii="Calibri" w:hAnsi="Calibri"/>
+                <w:b/>
+                <w:sz w:val="20"/>
+              </w:rPr>
               <w:t>Version</w:t>
             </w:r>
           </w:p>
@@ -2432,9 +2188,15 @@
         <w:tc>
           <w:tcPr>
             <w:tcW w:type="dxa" w:w="3135"/>
+            <w:shd w:fill="F2F2F2"/>
           </w:tcPr>
           <w:p>
             <w:r>
+              <w:rPr>
+                <w:rFonts w:ascii="Calibri" w:hAnsi="Calibri"/>
+                <w:b/>
+                <w:sz w:val="20"/>
+              </w:rPr>
               <w:t>Date</w:t>
             </w:r>
           </w:p>
@@ -2442,9 +2204,15 @@
         <w:tc>
           <w:tcPr>
             <w:tcW w:type="dxa" w:w="3135"/>
+            <w:shd w:fill="F2F2F2"/>
           </w:tcPr>
           <w:p>
             <w:r>
+              <w:rPr>
+                <w:rFonts w:ascii="Calibri" w:hAnsi="Calibri"/>
+                <w:b/>
+                <w:sz w:val="20"/>
+              </w:rPr>
               <w:t>Modifications</w:t>
             </w:r>
           </w:p>
@@ -2457,6 +2225,10 @@
           </w:tcPr>
           <w:p>
             <w:r>
+              <w:rPr>
+                <w:rFonts w:ascii="Calibri" w:hAnsi="Calibri"/>
+                <w:sz w:val="20"/>
+              </w:rPr>
               <w:t>1.1</w:t>
             </w:r>
           </w:p>
@@ -2467,6 +2239,10 @@
           </w:tcPr>
           <w:p>
             <w:r>
+              <w:rPr>
+                <w:rFonts w:ascii="Calibri" w:hAnsi="Calibri"/>
+                <w:sz w:val="20"/>
+              </w:rPr>
               <w:t>02/06/2026</w:t>
             </w:r>
           </w:p>
@@ -2477,12 +2253,74 @@
           </w:tcPr>
           <w:p>
             <w:r>
-              <w:t>Alignement LAFACTURE v1.1 — stack et flux réels</w:t>
+              <w:rPr>
+                <w:rFonts w:ascii="Calibri" w:hAnsi="Calibri"/>
+                <w:sz w:val="20"/>
+              </w:rPr>
+              <w:t>Identité LAFACTURE, fonctionnalités plan Pro/Stripe</w:t>
+            </w:r>
+          </w:p>
+        </w:tc>
+      </w:tr>
+      <w:tr>
+        <w:tc>
+          <w:tcPr>
+            <w:tcW w:type="dxa" w:w="3135"/>
+          </w:tcPr>
+          <w:p>
+            <w:r>
+              <w:rPr>
+                <w:rFonts w:ascii="Calibri" w:hAnsi="Calibri"/>
+                <w:sz w:val="20"/>
+              </w:rPr>
+              <w:t>2.0</w:t>
+            </w:r>
+          </w:p>
+        </w:tc>
+        <w:tc>
+          <w:tcPr>
+            <w:tcW w:type="dxa" w:w="3135"/>
+          </w:tcPr>
+          <w:p>
+            <w:r>
+              <w:rPr>
+                <w:rFonts w:ascii="Calibri" w:hAnsi="Calibri"/>
+                <w:sz w:val="20"/>
+              </w:rPr>
+              <w:t>08/06/2026</w:t>
+            </w:r>
+          </w:p>
+        </w:tc>
+        <w:tc>
+          <w:tcPr>
+            <w:tcW w:type="dxa" w:w="3135"/>
+          </w:tcPr>
+          <w:p>
+            <w:r>
+              <w:rPr>
+                <w:rFonts w:ascii="Calibri" w:hAnsi="Calibri"/>
+                <w:sz w:val="20"/>
+              </w:rPr>
+              <w:t>Mise à jour : retrait abonnement Stripe, accès libre aux exports CSV et rapports, stack actuelle</w:t>
             </w:r>
           </w:p>
         </w:tc>
       </w:tr>
     </w:tbl>
+    <w:p/>
+    <w:p/>
+    <w:p>
+      <w:pPr>
+        <w:jc w:val="center"/>
+      </w:pPr>
+      <w:r>
+        <w:rPr>
+          <w:color w:val="555555"/>
+          <w:sz w:val="18"/>
+        </w:rPr>
+        <w:t>LAFACTURE — Guide Utilisateur v2.0 — Juin 2026</w:t>
+      </w:r>
+    </w:p>
     <w:sectPr>
       <w:pgSz w:w="12240" w:h="15840"/>
       <w:pgMar w:top="1417" w:right="1417" w:bottom="1417" w:left="1417" w:header="720" w:footer="720" w:gutter="0"/>

</xml_diff>